<commit_message>
updated to add 2 new ibj record types VERSION, COMMENT
</commit_message>
<xml_diff>
--- a/compiler-internals/IBJ Format 2v0.docx
+++ b/compiler-internals/IBJ Format 2v0.docx
@@ -1,6 +1,6 @@
 
 <file path=word/document.xml><?xml version="1.0" encoding="utf-8"?>
-<w:document xmlns:wpc="http://schemas.microsoft.com/office/word/2010/wordprocessingCanvas" xmlns:cx="http://schemas.microsoft.com/office/drawing/2014/chartex" xmlns:cx1="http://schemas.microsoft.com/office/drawing/2015/9/8/chartex" xmlns:cx2="http://schemas.microsoft.com/office/drawing/2015/10/21/chartex" xmlns:cx3="http://schemas.microsoft.com/office/drawing/2016/5/9/chartex" xmlns:cx4="http://schemas.microsoft.com/office/drawing/2016/5/10/chartex" xmlns:cx5="http://schemas.microsoft.com/office/drawing/2016/5/11/chartex" xmlns:cx6="http://schemas.microsoft.com/office/drawing/2016/5/12/chartex" xmlns:cx7="http://schemas.microsoft.com/office/drawing/2016/5/13/chartex" xmlns:cx8="http://schemas.microsoft.com/office/drawing/2016/5/14/chartex" xmlns:mc="http://schemas.openxmlformats.org/markup-compatibility/2006" xmlns:aink="http://schemas.microsoft.com/office/drawing/2016/ink" xmlns:am3d="http://schemas.microsoft.com/office/drawing/2017/model3d" xmlns:o="urn:schemas-microsoft-com:office:office" xmlns:oel="http://schemas.microsoft.com/office/2019/extlst" xmlns:r="http://schemas.openxmlformats.org/officeDocument/2006/relationships" xmlns:m="http://schemas.openxmlformats.org/officeDocument/2006/math" xmlns:v="urn:schemas-microsoft-com:vml" xmlns:wp14="http://schemas.microsoft.com/office/word/2010/wordprocessingDrawing" xmlns:wp="http://schemas.openxmlformats.org/drawingml/2006/wordprocessingDrawing" xmlns:w10="urn:schemas-microsoft-com:office:word" xmlns:w="http://schemas.openxmlformats.org/wordprocessingml/2006/main" xmlns:w14="http://schemas.microsoft.com/office/word/2010/wordml" xmlns:w15="http://schemas.microsoft.com/office/word/2012/wordml" xmlns:w16cex="http://schemas.microsoft.com/office/word/2018/wordml/cex" xmlns:w16cid="http://schemas.microsoft.com/office/word/2016/wordml/cid" xmlns:w16="http://schemas.microsoft.com/office/word/2018/wordml" xmlns:w16sdtdh="http://schemas.microsoft.com/office/word/2020/wordml/sdtdatahash" xmlns:w16se="http://schemas.microsoft.com/office/word/2015/wordml/symex" xmlns:wpg="http://schemas.microsoft.com/office/word/2010/wordprocessingGroup" xmlns:wpi="http://schemas.microsoft.com/office/word/2010/wordprocessingInk" xmlns:wne="http://schemas.microsoft.com/office/word/2006/wordml" xmlns:wps="http://schemas.microsoft.com/office/word/2010/wordprocessingShape" mc:Ignorable="w14 w15 w16se w16cid w16 w16cex w16sdtdh wp14">
+<w:document xmlns:wpc="http://schemas.microsoft.com/office/word/2010/wordprocessingCanvas" xmlns:cx="http://schemas.microsoft.com/office/drawing/2014/chartex" xmlns:cx1="http://schemas.microsoft.com/office/drawing/2015/9/8/chartex" xmlns:cx2="http://schemas.microsoft.com/office/drawing/2015/10/21/chartex" xmlns:cx3="http://schemas.microsoft.com/office/drawing/2016/5/9/chartex" xmlns:cx4="http://schemas.microsoft.com/office/drawing/2016/5/10/chartex" xmlns:cx5="http://schemas.microsoft.com/office/drawing/2016/5/11/chartex" xmlns:cx6="http://schemas.microsoft.com/office/drawing/2016/5/12/chartex" xmlns:cx7="http://schemas.microsoft.com/office/drawing/2016/5/13/chartex" xmlns:cx8="http://schemas.microsoft.com/office/drawing/2016/5/14/chartex" xmlns:mc="http://schemas.openxmlformats.org/markup-compatibility/2006" xmlns:aink="http://schemas.microsoft.com/office/drawing/2016/ink" xmlns:am3d="http://schemas.microsoft.com/office/drawing/2017/model3d" xmlns:o="urn:schemas-microsoft-com:office:office" xmlns:oel="http://schemas.microsoft.com/office/2019/extlst" xmlns:r="http://schemas.openxmlformats.org/officeDocument/2006/relationships" xmlns:m="http://schemas.openxmlformats.org/officeDocument/2006/math" xmlns:v="urn:schemas-microsoft-com:vml" xmlns:wp14="http://schemas.microsoft.com/office/word/2010/wordprocessingDrawing" xmlns:wp="http://schemas.openxmlformats.org/drawingml/2006/wordprocessingDrawing" xmlns:w10="urn:schemas-microsoft-com:office:word" xmlns:w="http://schemas.openxmlformats.org/wordprocessingml/2006/main" xmlns:w14="http://schemas.microsoft.com/office/word/2010/wordml" xmlns:w15="http://schemas.microsoft.com/office/word/2012/wordml" xmlns:w16cex="http://schemas.microsoft.com/office/word/2018/wordml/cex" xmlns:w16cid="http://schemas.microsoft.com/office/word/2016/wordml/cid" xmlns:w16="http://schemas.microsoft.com/office/word/2018/wordml" xmlns:w16du="http://schemas.microsoft.com/office/word/2023/wordml/word16du" xmlns:w16sdtdh="http://schemas.microsoft.com/office/word/2020/wordml/sdtdatahash" xmlns:w16sdtfl="http://schemas.microsoft.com/office/word/2024/wordml/sdtformatlock" xmlns:w16se="http://schemas.microsoft.com/office/word/2015/wordml/symex" xmlns:wpg="http://schemas.microsoft.com/office/word/2010/wordprocessingGroup" xmlns:wpi="http://schemas.microsoft.com/office/word/2010/wordprocessingInk" xmlns:wne="http://schemas.microsoft.com/office/word/2006/wordml" xmlns:wps="http://schemas.microsoft.com/office/word/2010/wordprocessingShape" mc:Ignorable="w14 w15 w16se w16cid w16 w16cex w16sdtdh w16sdtfl w16du wp14">
   <w:body>
     <w:p>
       <w:pPr>
@@ -37,7 +37,28 @@
           <w:sz w:val="36"/>
           <w:szCs w:val="36"/>
         </w:rPr>
-        <w:t xml:space="preserve"> 2v0</w:t>
+        <w:t xml:space="preserve"> </w:t>
+      </w:r>
+      <w:r>
+        <w:rPr>
+          <w:sz w:val="36"/>
+          <w:szCs w:val="36"/>
+        </w:rPr>
+        <w:t>2</w:t>
+      </w:r>
+      <w:r>
+        <w:rPr>
+          <w:sz w:val="36"/>
+          <w:szCs w:val="36"/>
+        </w:rPr>
+        <w:t>v</w:t>
+      </w:r>
+      <w:r>
+        <w:rPr>
+          <w:sz w:val="36"/>
+          <w:szCs w:val="36"/>
+        </w:rPr>
+        <w:t>1</w:t>
       </w:r>
     </w:p>
     <w:p>
@@ -71,49 +92,49 @@
           <w:sz w:val="32"/>
           <w:szCs w:val="32"/>
         </w:rPr>
-        <w:t>3</w:t>
+        <w:t>12</w:t>
       </w:r>
       <w:r>
         <w:rPr>
           <w:sz w:val="32"/>
           <w:szCs w:val="32"/>
         </w:rPr>
-        <w:t xml:space="preserve">1 </w:t>
+        <w:t>th</w:t>
       </w:r>
       <w:r>
         <w:rPr>
           <w:sz w:val="32"/>
           <w:szCs w:val="32"/>
         </w:rPr>
-        <w:t>Sep</w:t>
+        <w:t xml:space="preserve"> </w:t>
       </w:r>
       <w:r>
         <w:rPr>
           <w:sz w:val="32"/>
           <w:szCs w:val="32"/>
         </w:rPr>
-        <w:t>t</w:t>
+        <w:t>April</w:t>
       </w:r>
       <w:r>
         <w:rPr>
           <w:sz w:val="32"/>
           <w:szCs w:val="32"/>
         </w:rPr>
-        <w:t>em</w:t>
+        <w:t xml:space="preserve"> </w:t>
       </w:r>
       <w:r>
         <w:rPr>
           <w:sz w:val="32"/>
           <w:szCs w:val="32"/>
         </w:rPr>
-        <w:t>ber 202</w:t>
+        <w:t>202</w:t>
       </w:r>
       <w:r>
         <w:rPr>
           <w:sz w:val="32"/>
           <w:szCs w:val="32"/>
         </w:rPr>
-        <w:t>3</w:t>
+        <w:t>5</w:t>
       </w:r>
     </w:p>
     <w:p/>
@@ -173,6 +194,8 @@
               <w:rFonts w:eastAsiaTheme="minorEastAsia"/>
               <w:noProof/>
               <w:kern w:val="2"/>
+              <w:sz w:val="24"/>
+              <w:szCs w:val="24"/>
               <w:lang w:eastAsia="en-GB"/>
               <w14:ligatures w14:val="standardContextual"/>
             </w:rPr>
@@ -186,7 +209,7 @@
           <w:r>
             <w:fldChar w:fldCharType="separate"/>
           </w:r>
-          <w:hyperlink w:anchor="_Toc144756823" w:history="1">
+          <w:hyperlink w:anchor="_Toc192672218" w:history="1">
             <w:r>
               <w:rPr>
                 <w:rStyle w:val="Hyperlink"/>
@@ -199,6 +222,8 @@
                 <w:rFonts w:eastAsiaTheme="minorEastAsia"/>
                 <w:noProof/>
                 <w:kern w:val="2"/>
+                <w:sz w:val="24"/>
+                <w:szCs w:val="24"/>
                 <w:lang w:eastAsia="en-GB"/>
                 <w14:ligatures w14:val="standardContextual"/>
               </w:rPr>
@@ -230,7 +255,7 @@
                 <w:noProof/>
                 <w:webHidden/>
               </w:rPr>
-              <w:instrText xml:space="preserve"> PAGEREF _Toc144756823 \h </w:instrText>
+              <w:instrText xml:space="preserve"> PAGEREF _Toc192672218 \h </w:instrText>
             </w:r>
             <w:r>
               <w:rPr>
@@ -272,11 +297,13 @@
               <w:rFonts w:eastAsiaTheme="minorEastAsia"/>
               <w:noProof/>
               <w:kern w:val="2"/>
+              <w:sz w:val="24"/>
+              <w:szCs w:val="24"/>
               <w:lang w:eastAsia="en-GB"/>
               <w14:ligatures w14:val="standardContextual"/>
             </w:rPr>
           </w:pPr>
-          <w:hyperlink w:anchor="_Toc144756824" w:history="1">
+          <w:hyperlink w:anchor="_Toc192672219" w:history="1">
             <w:r>
               <w:rPr>
                 <w:rStyle w:val="Hyperlink"/>
@@ -289,6 +316,8 @@
                 <w:rFonts w:eastAsiaTheme="minorEastAsia"/>
                 <w:noProof/>
                 <w:kern w:val="2"/>
+                <w:sz w:val="24"/>
+                <w:szCs w:val="24"/>
                 <w:lang w:eastAsia="en-GB"/>
                 <w14:ligatures w14:val="standardContextual"/>
               </w:rPr>
@@ -320,7 +349,7 @@
                 <w:noProof/>
                 <w:webHidden/>
               </w:rPr>
-              <w:instrText xml:space="preserve"> PAGEREF _Toc144756824 \h </w:instrText>
+              <w:instrText xml:space="preserve"> PAGEREF _Toc192672219 \h </w:instrText>
             </w:r>
             <w:r>
               <w:rPr>
@@ -362,11 +391,13 @@
               <w:rFonts w:eastAsiaTheme="minorEastAsia"/>
               <w:noProof/>
               <w:kern w:val="2"/>
+              <w:sz w:val="24"/>
+              <w:szCs w:val="24"/>
               <w:lang w:eastAsia="en-GB"/>
               <w14:ligatures w14:val="standardContextual"/>
             </w:rPr>
           </w:pPr>
-          <w:hyperlink w:anchor="_Toc144756825" w:history="1">
+          <w:hyperlink w:anchor="_Toc192672220" w:history="1">
             <w:r>
               <w:rPr>
                 <w:rStyle w:val="Hyperlink"/>
@@ -379,6 +410,8 @@
                 <w:rFonts w:eastAsiaTheme="minorEastAsia"/>
                 <w:noProof/>
                 <w:kern w:val="2"/>
+                <w:sz w:val="24"/>
+                <w:szCs w:val="24"/>
                 <w:lang w:eastAsia="en-GB"/>
                 <w14:ligatures w14:val="standardContextual"/>
               </w:rPr>
@@ -410,7 +443,7 @@
                 <w:noProof/>
                 <w:webHidden/>
               </w:rPr>
-              <w:instrText xml:space="preserve"> PAGEREF _Toc144756825 \h </w:instrText>
+              <w:instrText xml:space="preserve"> PAGEREF _Toc192672220 \h </w:instrText>
             </w:r>
             <w:r>
               <w:rPr>
@@ -452,11 +485,13 @@
               <w:rFonts w:eastAsiaTheme="minorEastAsia"/>
               <w:noProof/>
               <w:kern w:val="2"/>
+              <w:sz w:val="24"/>
+              <w:szCs w:val="24"/>
               <w:lang w:eastAsia="en-GB"/>
               <w14:ligatures w14:val="standardContextual"/>
             </w:rPr>
           </w:pPr>
-          <w:hyperlink w:anchor="_Toc144756826" w:history="1">
+          <w:hyperlink w:anchor="_Toc192672221" w:history="1">
             <w:r>
               <w:rPr>
                 <w:rStyle w:val="Hyperlink"/>
@@ -469,6 +504,8 @@
                 <w:rFonts w:eastAsiaTheme="minorEastAsia"/>
                 <w:noProof/>
                 <w:kern w:val="2"/>
+                <w:sz w:val="24"/>
+                <w:szCs w:val="24"/>
                 <w:lang w:eastAsia="en-GB"/>
                 <w14:ligatures w14:val="standardContextual"/>
               </w:rPr>
@@ -500,7 +537,7 @@
                 <w:noProof/>
                 <w:webHidden/>
               </w:rPr>
-              <w:instrText xml:space="preserve"> PAGEREF _Toc144756826 \h </w:instrText>
+              <w:instrText xml:space="preserve"> PAGEREF _Toc192672221 \h </w:instrText>
             </w:r>
             <w:r>
               <w:rPr>
@@ -542,11 +579,13 @@
               <w:rFonts w:eastAsiaTheme="minorEastAsia"/>
               <w:noProof/>
               <w:kern w:val="2"/>
+              <w:sz w:val="24"/>
+              <w:szCs w:val="24"/>
               <w:lang w:eastAsia="en-GB"/>
               <w14:ligatures w14:val="standardContextual"/>
             </w:rPr>
           </w:pPr>
-          <w:hyperlink w:anchor="_Toc144756827" w:history="1">
+          <w:hyperlink w:anchor="_Toc192672222" w:history="1">
             <w:r>
               <w:rPr>
                 <w:rStyle w:val="Hyperlink"/>
@@ -559,6 +598,8 @@
                 <w:rFonts w:eastAsiaTheme="minorEastAsia"/>
                 <w:noProof/>
                 <w:kern w:val="2"/>
+                <w:sz w:val="24"/>
+                <w:szCs w:val="24"/>
                 <w:lang w:eastAsia="en-GB"/>
                 <w14:ligatures w14:val="standardContextual"/>
               </w:rPr>
@@ -590,7 +631,7 @@
                 <w:noProof/>
                 <w:webHidden/>
               </w:rPr>
-              <w:instrText xml:space="preserve"> PAGEREF _Toc144756827 \h </w:instrText>
+              <w:instrText xml:space="preserve"> PAGEREF _Toc192672222 \h </w:instrText>
             </w:r>
             <w:r>
               <w:rPr>
@@ -632,11 +673,13 @@
               <w:rFonts w:eastAsiaTheme="minorEastAsia"/>
               <w:noProof/>
               <w:kern w:val="2"/>
+              <w:sz w:val="24"/>
+              <w:szCs w:val="24"/>
               <w:lang w:eastAsia="en-GB"/>
               <w14:ligatures w14:val="standardContextual"/>
             </w:rPr>
           </w:pPr>
-          <w:hyperlink w:anchor="_Toc144756828" w:history="1">
+          <w:hyperlink w:anchor="_Toc192672223" w:history="1">
             <w:r>
               <w:rPr>
                 <w:rStyle w:val="Hyperlink"/>
@@ -649,6 +692,8 @@
                 <w:rFonts w:eastAsiaTheme="minorEastAsia"/>
                 <w:noProof/>
                 <w:kern w:val="2"/>
+                <w:sz w:val="24"/>
+                <w:szCs w:val="24"/>
                 <w:lang w:eastAsia="en-GB"/>
                 <w14:ligatures w14:val="standardContextual"/>
               </w:rPr>
@@ -680,7 +725,7 @@
                 <w:noProof/>
                 <w:webHidden/>
               </w:rPr>
-              <w:instrText xml:space="preserve"> PAGEREF _Toc144756828 \h </w:instrText>
+              <w:instrText xml:space="preserve"> PAGEREF _Toc192672223 \h </w:instrText>
             </w:r>
             <w:r>
               <w:rPr>
@@ -722,11 +767,13 @@
               <w:rFonts w:eastAsiaTheme="minorEastAsia"/>
               <w:noProof/>
               <w:kern w:val="2"/>
+              <w:sz w:val="24"/>
+              <w:szCs w:val="24"/>
               <w:lang w:eastAsia="en-GB"/>
               <w14:ligatures w14:val="standardContextual"/>
             </w:rPr>
           </w:pPr>
-          <w:hyperlink w:anchor="_Toc144756829" w:history="1">
+          <w:hyperlink w:anchor="_Toc192672224" w:history="1">
             <w:r>
               <w:rPr>
                 <w:rStyle w:val="Hyperlink"/>
@@ -739,6 +786,8 @@
                 <w:rFonts w:eastAsiaTheme="minorEastAsia"/>
                 <w:noProof/>
                 <w:kern w:val="2"/>
+                <w:sz w:val="24"/>
+                <w:szCs w:val="24"/>
                 <w:lang w:eastAsia="en-GB"/>
                 <w14:ligatures w14:val="standardContextual"/>
               </w:rPr>
@@ -770,7 +819,7 @@
                 <w:noProof/>
                 <w:webHidden/>
               </w:rPr>
-              <w:instrText xml:space="preserve"> PAGEREF _Toc144756829 \h </w:instrText>
+              <w:instrText xml:space="preserve"> PAGEREF _Toc192672224 \h </w:instrText>
             </w:r>
             <w:r>
               <w:rPr>
@@ -812,11 +861,13 @@
               <w:rFonts w:eastAsiaTheme="minorEastAsia"/>
               <w:noProof/>
               <w:kern w:val="2"/>
+              <w:sz w:val="24"/>
+              <w:szCs w:val="24"/>
               <w:lang w:eastAsia="en-GB"/>
               <w14:ligatures w14:val="standardContextual"/>
             </w:rPr>
           </w:pPr>
-          <w:hyperlink w:anchor="_Toc144756830" w:history="1">
+          <w:hyperlink w:anchor="_Toc192672225" w:history="1">
             <w:r>
               <w:rPr>
                 <w:rStyle w:val="Hyperlink"/>
@@ -829,6 +880,8 @@
                 <w:rFonts w:eastAsiaTheme="minorEastAsia"/>
                 <w:noProof/>
                 <w:kern w:val="2"/>
+                <w:sz w:val="24"/>
+                <w:szCs w:val="24"/>
                 <w:lang w:eastAsia="en-GB"/>
                 <w14:ligatures w14:val="standardContextual"/>
               </w:rPr>
@@ -860,7 +913,7 @@
                 <w:noProof/>
                 <w:webHidden/>
               </w:rPr>
-              <w:instrText xml:space="preserve"> PAGEREF _Toc144756830 \h </w:instrText>
+              <w:instrText xml:space="preserve"> PAGEREF _Toc192672225 \h </w:instrText>
             </w:r>
             <w:r>
               <w:rPr>
@@ -902,11 +955,13 @@
               <w:rFonts w:eastAsiaTheme="minorEastAsia"/>
               <w:noProof/>
               <w:kern w:val="2"/>
+              <w:sz w:val="24"/>
+              <w:szCs w:val="24"/>
               <w:lang w:eastAsia="en-GB"/>
               <w14:ligatures w14:val="standardContextual"/>
             </w:rPr>
           </w:pPr>
-          <w:hyperlink w:anchor="_Toc144756831" w:history="1">
+          <w:hyperlink w:anchor="_Toc192672226" w:history="1">
             <w:r>
               <w:rPr>
                 <w:rStyle w:val="Hyperlink"/>
@@ -919,6 +974,8 @@
                 <w:rFonts w:eastAsiaTheme="minorEastAsia"/>
                 <w:noProof/>
                 <w:kern w:val="2"/>
+                <w:sz w:val="24"/>
+                <w:szCs w:val="24"/>
                 <w:lang w:eastAsia="en-GB"/>
                 <w14:ligatures w14:val="standardContextual"/>
               </w:rPr>
@@ -950,7 +1007,7 @@
                 <w:noProof/>
                 <w:webHidden/>
               </w:rPr>
-              <w:instrText xml:space="preserve"> PAGEREF _Toc144756831 \h </w:instrText>
+              <w:instrText xml:space="preserve"> PAGEREF _Toc192672226 \h </w:instrText>
             </w:r>
             <w:r>
               <w:rPr>
@@ -992,11 +1049,13 @@
               <w:rFonts w:eastAsiaTheme="minorEastAsia"/>
               <w:noProof/>
               <w:kern w:val="2"/>
+              <w:sz w:val="24"/>
+              <w:szCs w:val="24"/>
               <w:lang w:eastAsia="en-GB"/>
               <w14:ligatures w14:val="standardContextual"/>
             </w:rPr>
           </w:pPr>
-          <w:hyperlink w:anchor="_Toc144756832" w:history="1">
+          <w:hyperlink w:anchor="_Toc192672227" w:history="1">
             <w:r>
               <w:rPr>
                 <w:rStyle w:val="Hyperlink"/>
@@ -1009,6 +1068,8 @@
                 <w:rFonts w:eastAsiaTheme="minorEastAsia"/>
                 <w:noProof/>
                 <w:kern w:val="2"/>
+                <w:sz w:val="24"/>
+                <w:szCs w:val="24"/>
                 <w:lang w:eastAsia="en-GB"/>
                 <w14:ligatures w14:val="standardContextual"/>
               </w:rPr>
@@ -1040,7 +1101,7 @@
                 <w:noProof/>
                 <w:webHidden/>
               </w:rPr>
-              <w:instrText xml:space="preserve"> PAGEREF _Toc144756832 \h </w:instrText>
+              <w:instrText xml:space="preserve"> PAGEREF _Toc192672227 \h </w:instrText>
             </w:r>
             <w:r>
               <w:rPr>
@@ -1060,7 +1121,7 @@
                 <w:noProof/>
                 <w:webHidden/>
               </w:rPr>
-              <w:t>6</w:t>
+              <w:t>7</w:t>
             </w:r>
             <w:r>
               <w:rPr>
@@ -1082,11 +1143,13 @@
               <w:rFonts w:eastAsiaTheme="minorEastAsia"/>
               <w:noProof/>
               <w:kern w:val="2"/>
+              <w:sz w:val="24"/>
+              <w:szCs w:val="24"/>
               <w:lang w:eastAsia="en-GB"/>
               <w14:ligatures w14:val="standardContextual"/>
             </w:rPr>
           </w:pPr>
-          <w:hyperlink w:anchor="_Toc144756833" w:history="1">
+          <w:hyperlink w:anchor="_Toc192672228" w:history="1">
             <w:r>
               <w:rPr>
                 <w:rStyle w:val="Hyperlink"/>
@@ -1099,6 +1162,8 @@
                 <w:rFonts w:eastAsiaTheme="minorEastAsia"/>
                 <w:noProof/>
                 <w:kern w:val="2"/>
+                <w:sz w:val="24"/>
+                <w:szCs w:val="24"/>
                 <w:lang w:eastAsia="en-GB"/>
                 <w14:ligatures w14:val="standardContextual"/>
               </w:rPr>
@@ -1130,7 +1195,7 @@
                 <w:noProof/>
                 <w:webHidden/>
               </w:rPr>
-              <w:instrText xml:space="preserve"> PAGEREF _Toc144756833 \h </w:instrText>
+              <w:instrText xml:space="preserve"> PAGEREF _Toc192672228 \h </w:instrText>
             </w:r>
             <w:r>
               <w:rPr>
@@ -1172,11 +1237,13 @@
               <w:rFonts w:eastAsiaTheme="minorEastAsia"/>
               <w:noProof/>
               <w:kern w:val="2"/>
+              <w:sz w:val="24"/>
+              <w:szCs w:val="24"/>
               <w:lang w:eastAsia="en-GB"/>
               <w14:ligatures w14:val="standardContextual"/>
             </w:rPr>
           </w:pPr>
-          <w:hyperlink w:anchor="_Toc144756834" w:history="1">
+          <w:hyperlink w:anchor="_Toc192672229" w:history="1">
             <w:r>
               <w:rPr>
                 <w:rStyle w:val="Hyperlink"/>
@@ -1189,6 +1256,8 @@
                 <w:rFonts w:eastAsiaTheme="minorEastAsia"/>
                 <w:noProof/>
                 <w:kern w:val="2"/>
+                <w:sz w:val="24"/>
+                <w:szCs w:val="24"/>
                 <w:lang w:eastAsia="en-GB"/>
                 <w14:ligatures w14:val="standardContextual"/>
               </w:rPr>
@@ -1220,7 +1289,7 @@
                 <w:noProof/>
                 <w:webHidden/>
               </w:rPr>
-              <w:instrText xml:space="preserve"> PAGEREF _Toc144756834 \h </w:instrText>
+              <w:instrText xml:space="preserve"> PAGEREF _Toc192672229 \h </w:instrText>
             </w:r>
             <w:r>
               <w:rPr>
@@ -1262,11 +1331,13 @@
               <w:rFonts w:eastAsiaTheme="minorEastAsia"/>
               <w:noProof/>
               <w:kern w:val="2"/>
+              <w:sz w:val="24"/>
+              <w:szCs w:val="24"/>
               <w:lang w:eastAsia="en-GB"/>
               <w14:ligatures w14:val="standardContextual"/>
             </w:rPr>
           </w:pPr>
-          <w:hyperlink w:anchor="_Toc144756835" w:history="1">
+          <w:hyperlink w:anchor="_Toc192672230" w:history="1">
             <w:r>
               <w:rPr>
                 <w:rStyle w:val="Hyperlink"/>
@@ -1279,6 +1350,8 @@
                 <w:rFonts w:eastAsiaTheme="minorEastAsia"/>
                 <w:noProof/>
                 <w:kern w:val="2"/>
+                <w:sz w:val="24"/>
+                <w:szCs w:val="24"/>
                 <w:lang w:eastAsia="en-GB"/>
                 <w14:ligatures w14:val="standardContextual"/>
               </w:rPr>
@@ -1310,7 +1383,7 @@
                 <w:noProof/>
                 <w:webHidden/>
               </w:rPr>
-              <w:instrText xml:space="preserve"> PAGEREF _Toc144756835 \h </w:instrText>
+              <w:instrText xml:space="preserve"> PAGEREF _Toc192672230 \h </w:instrText>
             </w:r>
             <w:r>
               <w:rPr>
@@ -1352,11 +1425,13 @@
               <w:rFonts w:eastAsiaTheme="minorEastAsia"/>
               <w:noProof/>
               <w:kern w:val="2"/>
+              <w:sz w:val="24"/>
+              <w:szCs w:val="24"/>
               <w:lang w:eastAsia="en-GB"/>
               <w14:ligatures w14:val="standardContextual"/>
             </w:rPr>
           </w:pPr>
-          <w:hyperlink w:anchor="_Toc144756836" w:history="1">
+          <w:hyperlink w:anchor="_Toc192672231" w:history="1">
             <w:r>
               <w:rPr>
                 <w:rStyle w:val="Hyperlink"/>
@@ -1369,6 +1444,8 @@
                 <w:rFonts w:eastAsiaTheme="minorEastAsia"/>
                 <w:noProof/>
                 <w:kern w:val="2"/>
+                <w:sz w:val="24"/>
+                <w:szCs w:val="24"/>
                 <w:lang w:eastAsia="en-GB"/>
                 <w14:ligatures w14:val="standardContextual"/>
               </w:rPr>
@@ -1400,7 +1477,7 @@
                 <w:noProof/>
                 <w:webHidden/>
               </w:rPr>
-              <w:instrText xml:space="preserve"> PAGEREF _Toc144756836 \h </w:instrText>
+              <w:instrText xml:space="preserve"> PAGEREF _Toc192672231 \h </w:instrText>
             </w:r>
             <w:r>
               <w:rPr>
@@ -1442,11 +1519,13 @@
               <w:rFonts w:eastAsiaTheme="minorEastAsia"/>
               <w:noProof/>
               <w:kern w:val="2"/>
+              <w:sz w:val="24"/>
+              <w:szCs w:val="24"/>
               <w:lang w:eastAsia="en-GB"/>
               <w14:ligatures w14:val="standardContextual"/>
             </w:rPr>
           </w:pPr>
-          <w:hyperlink w:anchor="_Toc144756837" w:history="1">
+          <w:hyperlink w:anchor="_Toc192672232" w:history="1">
             <w:r>
               <w:rPr>
                 <w:rStyle w:val="Hyperlink"/>
@@ -1459,6 +1538,8 @@
                 <w:rFonts w:eastAsiaTheme="minorEastAsia"/>
                 <w:noProof/>
                 <w:kern w:val="2"/>
+                <w:sz w:val="24"/>
+                <w:szCs w:val="24"/>
                 <w:lang w:eastAsia="en-GB"/>
                 <w14:ligatures w14:val="standardContextual"/>
               </w:rPr>
@@ -1490,7 +1571,7 @@
                 <w:noProof/>
                 <w:webHidden/>
               </w:rPr>
-              <w:instrText xml:space="preserve"> PAGEREF _Toc144756837 \h </w:instrText>
+              <w:instrText xml:space="preserve"> PAGEREF _Toc192672232 \h </w:instrText>
             </w:r>
             <w:r>
               <w:rPr>
@@ -1510,7 +1591,7 @@
                 <w:noProof/>
                 <w:webHidden/>
               </w:rPr>
-              <w:t>7</w:t>
+              <w:t>8</w:t>
             </w:r>
             <w:r>
               <w:rPr>
@@ -1532,11 +1613,13 @@
               <w:rFonts w:eastAsiaTheme="minorEastAsia"/>
               <w:noProof/>
               <w:kern w:val="2"/>
+              <w:sz w:val="24"/>
+              <w:szCs w:val="24"/>
               <w:lang w:eastAsia="en-GB"/>
               <w14:ligatures w14:val="standardContextual"/>
             </w:rPr>
           </w:pPr>
-          <w:hyperlink w:anchor="_Toc144756838" w:history="1">
+          <w:hyperlink w:anchor="_Toc192672233" w:history="1">
             <w:r>
               <w:rPr>
                 <w:rStyle w:val="Hyperlink"/>
@@ -1549,6 +1632,8 @@
                 <w:rFonts w:eastAsiaTheme="minorEastAsia"/>
                 <w:noProof/>
                 <w:kern w:val="2"/>
+                <w:sz w:val="24"/>
+                <w:szCs w:val="24"/>
                 <w:lang w:eastAsia="en-GB"/>
                 <w14:ligatures w14:val="standardContextual"/>
               </w:rPr>
@@ -1580,7 +1665,7 @@
                 <w:noProof/>
                 <w:webHidden/>
               </w:rPr>
-              <w:instrText xml:space="preserve"> PAGEREF _Toc144756838 \h </w:instrText>
+              <w:instrText xml:space="preserve"> PAGEREF _Toc192672233 \h </w:instrText>
             </w:r>
             <w:r>
               <w:rPr>
@@ -1622,11 +1707,13 @@
               <w:rFonts w:eastAsiaTheme="minorEastAsia"/>
               <w:noProof/>
               <w:kern w:val="2"/>
+              <w:sz w:val="24"/>
+              <w:szCs w:val="24"/>
               <w:lang w:eastAsia="en-GB"/>
               <w14:ligatures w14:val="standardContextual"/>
             </w:rPr>
           </w:pPr>
-          <w:hyperlink w:anchor="_Toc144756839" w:history="1">
+          <w:hyperlink w:anchor="_Toc192672234" w:history="1">
             <w:r>
               <w:rPr>
                 <w:rStyle w:val="Hyperlink"/>
@@ -1639,6 +1726,8 @@
                 <w:rFonts w:eastAsiaTheme="minorEastAsia"/>
                 <w:noProof/>
                 <w:kern w:val="2"/>
+                <w:sz w:val="24"/>
+                <w:szCs w:val="24"/>
                 <w:lang w:eastAsia="en-GB"/>
                 <w14:ligatures w14:val="standardContextual"/>
               </w:rPr>
@@ -1670,7 +1759,7 @@
                 <w:noProof/>
                 <w:webHidden/>
               </w:rPr>
-              <w:instrText xml:space="preserve"> PAGEREF _Toc144756839 \h </w:instrText>
+              <w:instrText xml:space="preserve"> PAGEREF _Toc192672234 \h </w:instrText>
             </w:r>
             <w:r>
               <w:rPr>
@@ -1712,11 +1801,13 @@
               <w:rFonts w:eastAsiaTheme="minorEastAsia"/>
               <w:noProof/>
               <w:kern w:val="2"/>
+              <w:sz w:val="24"/>
+              <w:szCs w:val="24"/>
               <w:lang w:eastAsia="en-GB"/>
               <w14:ligatures w14:val="standardContextual"/>
             </w:rPr>
           </w:pPr>
-          <w:hyperlink w:anchor="_Toc144756840" w:history="1">
+          <w:hyperlink w:anchor="_Toc192672235" w:history="1">
             <w:r>
               <w:rPr>
                 <w:rStyle w:val="Hyperlink"/>
@@ -1729,6 +1820,8 @@
                 <w:rFonts w:eastAsiaTheme="minorEastAsia"/>
                 <w:noProof/>
                 <w:kern w:val="2"/>
+                <w:sz w:val="24"/>
+                <w:szCs w:val="24"/>
                 <w:lang w:eastAsia="en-GB"/>
                 <w14:ligatures w14:val="standardContextual"/>
               </w:rPr>
@@ -1760,7 +1853,7 @@
                 <w:noProof/>
                 <w:webHidden/>
               </w:rPr>
-              <w:instrText xml:space="preserve"> PAGEREF _Toc144756840 \h </w:instrText>
+              <w:instrText xml:space="preserve"> PAGEREF _Toc192672235 \h </w:instrText>
             </w:r>
             <w:r>
               <w:rPr>
@@ -1802,11 +1895,13 @@
               <w:rFonts w:eastAsiaTheme="minorEastAsia"/>
               <w:noProof/>
               <w:kern w:val="2"/>
+              <w:sz w:val="24"/>
+              <w:szCs w:val="24"/>
               <w:lang w:eastAsia="en-GB"/>
               <w14:ligatures w14:val="standardContextual"/>
             </w:rPr>
           </w:pPr>
-          <w:hyperlink w:anchor="_Toc144756841" w:history="1">
+          <w:hyperlink w:anchor="_Toc192672236" w:history="1">
             <w:r>
               <w:rPr>
                 <w:rStyle w:val="Hyperlink"/>
@@ -1819,6 +1914,8 @@
                 <w:rFonts w:eastAsiaTheme="minorEastAsia"/>
                 <w:noProof/>
                 <w:kern w:val="2"/>
+                <w:sz w:val="24"/>
+                <w:szCs w:val="24"/>
                 <w:lang w:eastAsia="en-GB"/>
                 <w14:ligatures w14:val="standardContextual"/>
               </w:rPr>
@@ -1850,7 +1947,7 @@
                 <w:noProof/>
                 <w:webHidden/>
               </w:rPr>
-              <w:instrText xml:space="preserve"> PAGEREF _Toc144756841 \h </w:instrText>
+              <w:instrText xml:space="preserve"> PAGEREF _Toc192672236 \h </w:instrText>
             </w:r>
             <w:r>
               <w:rPr>
@@ -1892,11 +1989,13 @@
               <w:rFonts w:eastAsiaTheme="minorEastAsia"/>
               <w:noProof/>
               <w:kern w:val="2"/>
+              <w:sz w:val="24"/>
+              <w:szCs w:val="24"/>
               <w:lang w:eastAsia="en-GB"/>
               <w14:ligatures w14:val="standardContextual"/>
             </w:rPr>
           </w:pPr>
-          <w:hyperlink w:anchor="_Toc144756842" w:history="1">
+          <w:hyperlink w:anchor="_Toc192672237" w:history="1">
             <w:r>
               <w:rPr>
                 <w:rStyle w:val="Hyperlink"/>
@@ -1909,6 +2008,8 @@
                 <w:rFonts w:eastAsiaTheme="minorEastAsia"/>
                 <w:noProof/>
                 <w:kern w:val="2"/>
+                <w:sz w:val="24"/>
+                <w:szCs w:val="24"/>
                 <w:lang w:eastAsia="en-GB"/>
                 <w14:ligatures w14:val="standardContextual"/>
               </w:rPr>
@@ -1940,7 +2041,7 @@
                 <w:noProof/>
                 <w:webHidden/>
               </w:rPr>
-              <w:instrText xml:space="preserve"> PAGEREF _Toc144756842 \h </w:instrText>
+              <w:instrText xml:space="preserve"> PAGEREF _Toc192672237 \h </w:instrText>
             </w:r>
             <w:r>
               <w:rPr>
@@ -1982,11 +2083,13 @@
               <w:rFonts w:eastAsiaTheme="minorEastAsia"/>
               <w:noProof/>
               <w:kern w:val="2"/>
+              <w:sz w:val="24"/>
+              <w:szCs w:val="24"/>
               <w:lang w:eastAsia="en-GB"/>
               <w14:ligatures w14:val="standardContextual"/>
             </w:rPr>
           </w:pPr>
-          <w:hyperlink w:anchor="_Toc144756843" w:history="1">
+          <w:hyperlink w:anchor="_Toc192672238" w:history="1">
             <w:r>
               <w:rPr>
                 <w:rStyle w:val="Hyperlink"/>
@@ -1999,6 +2102,8 @@
                 <w:rFonts w:eastAsiaTheme="minorEastAsia"/>
                 <w:noProof/>
                 <w:kern w:val="2"/>
+                <w:sz w:val="24"/>
+                <w:szCs w:val="24"/>
                 <w:lang w:eastAsia="en-GB"/>
                 <w14:ligatures w14:val="standardContextual"/>
               </w:rPr>
@@ -2030,7 +2135,7 @@
                 <w:noProof/>
                 <w:webHidden/>
               </w:rPr>
-              <w:instrText xml:space="preserve"> PAGEREF _Toc144756843 \h </w:instrText>
+              <w:instrText xml:space="preserve"> PAGEREF _Toc192672238 \h </w:instrText>
             </w:r>
             <w:r>
               <w:rPr>
@@ -2050,7 +2155,7 @@
                 <w:noProof/>
                 <w:webHidden/>
               </w:rPr>
-              <w:t>8</w:t>
+              <w:t>9</w:t>
             </w:r>
             <w:r>
               <w:rPr>
@@ -2072,11 +2177,13 @@
               <w:rFonts w:eastAsiaTheme="minorEastAsia"/>
               <w:noProof/>
               <w:kern w:val="2"/>
+              <w:sz w:val="24"/>
+              <w:szCs w:val="24"/>
               <w:lang w:eastAsia="en-GB"/>
               <w14:ligatures w14:val="standardContextual"/>
             </w:rPr>
           </w:pPr>
-          <w:hyperlink w:anchor="_Toc144756844" w:history="1">
+          <w:hyperlink w:anchor="_Toc192672239" w:history="1">
             <w:r>
               <w:rPr>
                 <w:rStyle w:val="Hyperlink"/>
@@ -2089,6 +2196,8 @@
                 <w:rFonts w:eastAsiaTheme="minorEastAsia"/>
                 <w:noProof/>
                 <w:kern w:val="2"/>
+                <w:sz w:val="24"/>
+                <w:szCs w:val="24"/>
                 <w:lang w:eastAsia="en-GB"/>
                 <w14:ligatures w14:val="standardContextual"/>
               </w:rPr>
@@ -2120,7 +2229,7 @@
                 <w:noProof/>
                 <w:webHidden/>
               </w:rPr>
-              <w:instrText xml:space="preserve"> PAGEREF _Toc144756844 \h </w:instrText>
+              <w:instrText xml:space="preserve"> PAGEREF _Toc192672239 \h </w:instrText>
             </w:r>
             <w:r>
               <w:rPr>
@@ -2140,7 +2249,7 @@
                 <w:noProof/>
                 <w:webHidden/>
               </w:rPr>
-              <w:t>8</w:t>
+              <w:t>9</w:t>
             </w:r>
             <w:r>
               <w:rPr>
@@ -2162,11 +2271,13 @@
               <w:rFonts w:eastAsiaTheme="minorEastAsia"/>
               <w:noProof/>
               <w:kern w:val="2"/>
+              <w:sz w:val="24"/>
+              <w:szCs w:val="24"/>
               <w:lang w:eastAsia="en-GB"/>
               <w14:ligatures w14:val="standardContextual"/>
             </w:rPr>
           </w:pPr>
-          <w:hyperlink w:anchor="_Toc144756845" w:history="1">
+          <w:hyperlink w:anchor="_Toc192672240" w:history="1">
             <w:r>
               <w:rPr>
                 <w:rStyle w:val="Hyperlink"/>
@@ -2179,6 +2290,8 @@
                 <w:rFonts w:eastAsiaTheme="minorEastAsia"/>
                 <w:noProof/>
                 <w:kern w:val="2"/>
+                <w:sz w:val="24"/>
+                <w:szCs w:val="24"/>
                 <w:lang w:eastAsia="en-GB"/>
                 <w14:ligatures w14:val="standardContextual"/>
               </w:rPr>
@@ -2210,7 +2323,7 @@
                 <w:noProof/>
                 <w:webHidden/>
               </w:rPr>
-              <w:instrText xml:space="preserve"> PAGEREF _Toc144756845 \h </w:instrText>
+              <w:instrText xml:space="preserve"> PAGEREF _Toc192672240 \h </w:instrText>
             </w:r>
             <w:r>
               <w:rPr>
@@ -2252,11 +2365,13 @@
               <w:rFonts w:eastAsiaTheme="minorEastAsia"/>
               <w:noProof/>
               <w:kern w:val="2"/>
+              <w:sz w:val="24"/>
+              <w:szCs w:val="24"/>
               <w:lang w:eastAsia="en-GB"/>
               <w14:ligatures w14:val="standardContextual"/>
             </w:rPr>
           </w:pPr>
-          <w:hyperlink w:anchor="_Toc144756846" w:history="1">
+          <w:hyperlink w:anchor="_Toc192672241" w:history="1">
             <w:r>
               <w:rPr>
                 <w:rStyle w:val="Hyperlink"/>
@@ -2269,6 +2384,8 @@
                 <w:rFonts w:eastAsiaTheme="minorEastAsia"/>
                 <w:noProof/>
                 <w:kern w:val="2"/>
+                <w:sz w:val="24"/>
+                <w:szCs w:val="24"/>
                 <w:lang w:eastAsia="en-GB"/>
                 <w14:ligatures w14:val="standardContextual"/>
               </w:rPr>
@@ -2300,7 +2417,7 @@
                 <w:noProof/>
                 <w:webHidden/>
               </w:rPr>
-              <w:instrText xml:space="preserve"> PAGEREF _Toc144756846 \h </w:instrText>
+              <w:instrText xml:space="preserve"> PAGEREF _Toc192672241 \h </w:instrText>
             </w:r>
             <w:r>
               <w:rPr>
@@ -2342,11 +2459,13 @@
               <w:rFonts w:eastAsiaTheme="minorEastAsia"/>
               <w:noProof/>
               <w:kern w:val="2"/>
+              <w:sz w:val="24"/>
+              <w:szCs w:val="24"/>
               <w:lang w:eastAsia="en-GB"/>
               <w14:ligatures w14:val="standardContextual"/>
             </w:rPr>
           </w:pPr>
-          <w:hyperlink w:anchor="_Toc144756847" w:history="1">
+          <w:hyperlink w:anchor="_Toc192672242" w:history="1">
             <w:r>
               <w:rPr>
                 <w:rStyle w:val="Hyperlink"/>
@@ -2359,6 +2478,8 @@
                 <w:rFonts w:eastAsiaTheme="minorEastAsia"/>
                 <w:noProof/>
                 <w:kern w:val="2"/>
+                <w:sz w:val="24"/>
+                <w:szCs w:val="24"/>
                 <w:lang w:eastAsia="en-GB"/>
                 <w14:ligatures w14:val="standardContextual"/>
               </w:rPr>
@@ -2390,7 +2511,7 @@
                 <w:noProof/>
                 <w:webHidden/>
               </w:rPr>
-              <w:instrText xml:space="preserve"> PAGEREF _Toc144756847 \h </w:instrText>
+              <w:instrText xml:space="preserve"> PAGEREF _Toc192672242 \h </w:instrText>
             </w:r>
             <w:r>
               <w:rPr>
@@ -2432,11 +2553,13 @@
               <w:rFonts w:eastAsiaTheme="minorEastAsia"/>
               <w:noProof/>
               <w:kern w:val="2"/>
+              <w:sz w:val="24"/>
+              <w:szCs w:val="24"/>
               <w:lang w:eastAsia="en-GB"/>
               <w14:ligatures w14:val="standardContextual"/>
             </w:rPr>
           </w:pPr>
-          <w:hyperlink w:anchor="_Toc144756848" w:history="1">
+          <w:hyperlink w:anchor="_Toc192672243" w:history="1">
             <w:r>
               <w:rPr>
                 <w:rStyle w:val="Hyperlink"/>
@@ -2449,6 +2572,8 @@
                 <w:rFonts w:eastAsiaTheme="minorEastAsia"/>
                 <w:noProof/>
                 <w:kern w:val="2"/>
+                <w:sz w:val="24"/>
+                <w:szCs w:val="24"/>
                 <w:lang w:eastAsia="en-GB"/>
                 <w14:ligatures w14:val="standardContextual"/>
               </w:rPr>
@@ -2480,7 +2605,7 @@
                 <w:noProof/>
                 <w:webHidden/>
               </w:rPr>
-              <w:instrText xml:space="preserve"> PAGEREF _Toc144756848 \h </w:instrText>
+              <w:instrText xml:space="preserve"> PAGEREF _Toc192672243 \h </w:instrText>
             </w:r>
             <w:r>
               <w:rPr>
@@ -2522,11 +2647,13 @@
               <w:rFonts w:eastAsiaTheme="minorEastAsia"/>
               <w:noProof/>
               <w:kern w:val="2"/>
+              <w:sz w:val="24"/>
+              <w:szCs w:val="24"/>
               <w:lang w:eastAsia="en-GB"/>
               <w14:ligatures w14:val="standardContextual"/>
             </w:rPr>
           </w:pPr>
-          <w:hyperlink w:anchor="_Toc144756849" w:history="1">
+          <w:hyperlink w:anchor="_Toc192672244" w:history="1">
             <w:r>
               <w:rPr>
                 <w:rStyle w:val="Hyperlink"/>
@@ -2539,6 +2666,8 @@
                 <w:rFonts w:eastAsiaTheme="minorEastAsia"/>
                 <w:noProof/>
                 <w:kern w:val="2"/>
+                <w:sz w:val="24"/>
+                <w:szCs w:val="24"/>
                 <w:lang w:eastAsia="en-GB"/>
                 <w14:ligatures w14:val="standardContextual"/>
               </w:rPr>
@@ -2570,7 +2699,7 @@
                 <w:noProof/>
                 <w:webHidden/>
               </w:rPr>
-              <w:instrText xml:space="preserve"> PAGEREF _Toc144756849 \h </w:instrText>
+              <w:instrText xml:space="preserve"> PAGEREF _Toc192672244 \h </w:instrText>
             </w:r>
             <w:r>
               <w:rPr>
@@ -2591,6 +2720,194 @@
                 <w:webHidden/>
               </w:rPr>
               <w:t>9</w:t>
+            </w:r>
+            <w:r>
+              <w:rPr>
+                <w:noProof/>
+                <w:webHidden/>
+              </w:rPr>
+              <w:fldChar w:fldCharType="end"/>
+            </w:r>
+          </w:hyperlink>
+        </w:p>
+        <w:p>
+          <w:pPr>
+            <w:pStyle w:val="TOC2"/>
+            <w:tabs>
+              <w:tab w:val="left" w:pos="1100"/>
+              <w:tab w:val="right" w:leader="dot" w:pos="9016"/>
+            </w:tabs>
+            <w:rPr>
+              <w:rFonts w:eastAsiaTheme="minorEastAsia"/>
+              <w:noProof/>
+              <w:kern w:val="2"/>
+              <w:sz w:val="24"/>
+              <w:szCs w:val="24"/>
+              <w:lang w:eastAsia="en-GB"/>
+              <w14:ligatures w14:val="standardContextual"/>
+            </w:rPr>
+          </w:pPr>
+          <w:hyperlink w:anchor="_Toc192672245" w:history="1">
+            <w:r>
+              <w:rPr>
+                <w:rStyle w:val="Hyperlink"/>
+                <w:noProof/>
+              </w:rPr>
+              <w:t>3.24.</w:t>
+            </w:r>
+            <w:r>
+              <w:rPr>
+                <w:rFonts w:eastAsiaTheme="minorEastAsia"/>
+                <w:noProof/>
+                <w:kern w:val="2"/>
+                <w:sz w:val="24"/>
+                <w:szCs w:val="24"/>
+                <w:lang w:eastAsia="en-GB"/>
+                <w14:ligatures w14:val="standardContextual"/>
+              </w:rPr>
+              <w:tab/>
+            </w:r>
+            <w:r>
+              <w:rPr>
+                <w:rStyle w:val="Hyperlink"/>
+                <w:noProof/>
+              </w:rPr>
+              <w:t>VERSION</w:t>
+            </w:r>
+            <w:r>
+              <w:rPr>
+                <w:noProof/>
+                <w:webHidden/>
+              </w:rPr>
+              <w:tab/>
+            </w:r>
+            <w:r>
+              <w:rPr>
+                <w:noProof/>
+                <w:webHidden/>
+              </w:rPr>
+              <w:fldChar w:fldCharType="begin"/>
+            </w:r>
+            <w:r>
+              <w:rPr>
+                <w:noProof/>
+                <w:webHidden/>
+              </w:rPr>
+              <w:instrText xml:space="preserve"> PAGEREF _Toc192672245 \h </w:instrText>
+            </w:r>
+            <w:r>
+              <w:rPr>
+                <w:noProof/>
+                <w:webHidden/>
+              </w:rPr>
+            </w:r>
+            <w:r>
+              <w:rPr>
+                <w:noProof/>
+                <w:webHidden/>
+              </w:rPr>
+              <w:fldChar w:fldCharType="separate"/>
+            </w:r>
+            <w:r>
+              <w:rPr>
+                <w:noProof/>
+                <w:webHidden/>
+              </w:rPr>
+              <w:t>10</w:t>
+            </w:r>
+            <w:r>
+              <w:rPr>
+                <w:noProof/>
+                <w:webHidden/>
+              </w:rPr>
+              <w:fldChar w:fldCharType="end"/>
+            </w:r>
+          </w:hyperlink>
+        </w:p>
+        <w:p>
+          <w:pPr>
+            <w:pStyle w:val="TOC2"/>
+            <w:tabs>
+              <w:tab w:val="left" w:pos="1100"/>
+              <w:tab w:val="right" w:leader="dot" w:pos="9016"/>
+            </w:tabs>
+            <w:rPr>
+              <w:rFonts w:eastAsiaTheme="minorEastAsia"/>
+              <w:noProof/>
+              <w:kern w:val="2"/>
+              <w:sz w:val="24"/>
+              <w:szCs w:val="24"/>
+              <w:lang w:eastAsia="en-GB"/>
+              <w14:ligatures w14:val="standardContextual"/>
+            </w:rPr>
+          </w:pPr>
+          <w:hyperlink w:anchor="_Toc192672246" w:history="1">
+            <w:r>
+              <w:rPr>
+                <w:rStyle w:val="Hyperlink"/>
+                <w:noProof/>
+              </w:rPr>
+              <w:t>3.25.</w:t>
+            </w:r>
+            <w:r>
+              <w:rPr>
+                <w:rFonts w:eastAsiaTheme="minorEastAsia"/>
+                <w:noProof/>
+                <w:kern w:val="2"/>
+                <w:sz w:val="24"/>
+                <w:szCs w:val="24"/>
+                <w:lang w:eastAsia="en-GB"/>
+                <w14:ligatures w14:val="standardContextual"/>
+              </w:rPr>
+              <w:tab/>
+            </w:r>
+            <w:r>
+              <w:rPr>
+                <w:rStyle w:val="Hyperlink"/>
+                <w:noProof/>
+              </w:rPr>
+              <w:t>COMMENT</w:t>
+            </w:r>
+            <w:r>
+              <w:rPr>
+                <w:noProof/>
+                <w:webHidden/>
+              </w:rPr>
+              <w:tab/>
+            </w:r>
+            <w:r>
+              <w:rPr>
+                <w:noProof/>
+                <w:webHidden/>
+              </w:rPr>
+              <w:fldChar w:fldCharType="begin"/>
+            </w:r>
+            <w:r>
+              <w:rPr>
+                <w:noProof/>
+                <w:webHidden/>
+              </w:rPr>
+              <w:instrText xml:space="preserve"> PAGEREF _Toc192672246 \h </w:instrText>
+            </w:r>
+            <w:r>
+              <w:rPr>
+                <w:noProof/>
+                <w:webHidden/>
+              </w:rPr>
+            </w:r>
+            <w:r>
+              <w:rPr>
+                <w:noProof/>
+                <w:webHidden/>
+              </w:rPr>
+              <w:fldChar w:fldCharType="separate"/>
+            </w:r>
+            <w:r>
+              <w:rPr>
+                <w:noProof/>
+                <w:webHidden/>
+              </w:rPr>
+              <w:t>10</w:t>
             </w:r>
             <w:r>
               <w:rPr>
@@ -2605,18 +2922,20 @@
           <w:pPr>
             <w:pStyle w:val="TOC1"/>
             <w:tabs>
-              <w:tab w:val="left" w:pos="1320"/>
+              <w:tab w:val="left" w:pos="1540"/>
               <w:tab w:val="right" w:leader="dot" w:pos="9016"/>
             </w:tabs>
             <w:rPr>
               <w:rFonts w:eastAsiaTheme="minorEastAsia"/>
               <w:noProof/>
               <w:kern w:val="2"/>
+              <w:sz w:val="24"/>
+              <w:szCs w:val="24"/>
               <w:lang w:eastAsia="en-GB"/>
               <w14:ligatures w14:val="standardContextual"/>
             </w:rPr>
           </w:pPr>
-          <w:hyperlink w:anchor="_Toc144756850" w:history="1">
+          <w:hyperlink w:anchor="_Toc192672247" w:history="1">
             <w:r>
               <w:rPr>
                 <w:rStyle w:val="Hyperlink"/>
@@ -2629,6 +2948,8 @@
                 <w:rFonts w:eastAsiaTheme="minorEastAsia"/>
                 <w:noProof/>
                 <w:kern w:val="2"/>
+                <w:sz w:val="24"/>
+                <w:szCs w:val="24"/>
                 <w:lang w:eastAsia="en-GB"/>
                 <w14:ligatures w14:val="standardContextual"/>
               </w:rPr>
@@ -2660,7 +2981,7 @@
                 <w:noProof/>
                 <w:webHidden/>
               </w:rPr>
-              <w:instrText xml:space="preserve"> PAGEREF _Toc144756850 \h </w:instrText>
+              <w:instrText xml:space="preserve"> PAGEREF _Toc192672247 \h </w:instrText>
             </w:r>
             <w:r>
               <w:rPr>
@@ -2680,7 +3001,7 @@
                 <w:noProof/>
                 <w:webHidden/>
               </w:rPr>
-              <w:t>10</w:t>
+              <w:t>11</w:t>
             </w:r>
             <w:r>
               <w:rPr>
@@ -2714,7 +3035,7 @@
         <w:pStyle w:val="Heading1"/>
         <w:jc w:val="left"/>
       </w:pPr>
-      <w:bookmarkStart w:id="0" w:name="_Toc144756823"/>
+      <w:bookmarkStart w:id="0" w:name="_Toc192672218"/>
       <w:r>
         <w:lastRenderedPageBreak/>
         <w:t>Philosophy</w:t>
@@ -2792,7 +3113,7 @@
         <w:pStyle w:val="Heading1"/>
         <w:jc w:val="left"/>
       </w:pPr>
-      <w:bookmarkStart w:id="1" w:name="_Toc144756824"/>
+      <w:bookmarkStart w:id="1" w:name="_Toc192672219"/>
       <w:r>
         <w:lastRenderedPageBreak/>
         <w:t>File Layout</w:t>
@@ -3018,6 +3339,15 @@
       </w:r>
     </w:p>
     <w:p/>
+    <w:p>
+      <w:r>
+        <w:t>The ‘IF VERSION’ record must be the first IBJ record in a file</w:t>
+      </w:r>
+      <w:r>
+        <w:t>.</w:t>
+      </w:r>
+    </w:p>
+    <w:p/>
     <w:tbl>
       <w:tblPr>
         <w:tblStyle w:val="TableGrid"/>
@@ -3190,13 +3520,8 @@
             <w:tcW w:w="5387" w:type="dxa"/>
           </w:tcPr>
           <w:p>
-            <w:proofErr w:type="spellStart"/>
-            <w:r>
-              <w:t>const</w:t>
-            </w:r>
-            <w:proofErr w:type="spellEnd"/>
-            <w:r>
-              <w:t xml:space="preserve"> seg offset code word</w:t>
+            <w:r>
+              <w:t>const seg offset code word</w:t>
             </w:r>
           </w:p>
         </w:tc>
@@ -3850,6 +4175,70 @@
           <w:p>
             <w:r>
               <w:t>external name absolute offset code word (data external)</w:t>
+            </w:r>
+          </w:p>
+        </w:tc>
+      </w:tr>
+      <w:tr>
+        <w:tc>
+          <w:tcPr>
+            <w:tcW w:w="1838" w:type="dxa"/>
+          </w:tcPr>
+          <w:p>
+            <w:r>
+              <w:t>X</w:t>
+            </w:r>
+          </w:p>
+        </w:tc>
+        <w:tc>
+          <w:tcPr>
+            <w:tcW w:w="1701" w:type="dxa"/>
+          </w:tcPr>
+          <w:p>
+            <w:r>
+              <w:t>IF VERSION</w:t>
+            </w:r>
+          </w:p>
+        </w:tc>
+        <w:tc>
+          <w:tcPr>
+            <w:tcW w:w="5387" w:type="dxa"/>
+          </w:tcPr>
+          <w:p>
+            <w:r>
+              <w:t>IBJ file format version</w:t>
+            </w:r>
+          </w:p>
+        </w:tc>
+      </w:tr>
+      <w:tr>
+        <w:tc>
+          <w:tcPr>
+            <w:tcW w:w="1838" w:type="dxa"/>
+          </w:tcPr>
+          <w:p>
+            <w:r>
+              <w:t>Y</w:t>
+            </w:r>
+          </w:p>
+        </w:tc>
+        <w:tc>
+          <w:tcPr>
+            <w:tcW w:w="1701" w:type="dxa"/>
+          </w:tcPr>
+          <w:p>
+            <w:r>
+              <w:t>IF COMMENT</w:t>
+            </w:r>
+          </w:p>
+        </w:tc>
+        <w:tc>
+          <w:tcPr>
+            <w:tcW w:w="5387" w:type="dxa"/>
+          </w:tcPr>
+          <w:p>
+            <w:r>
+              <w:t>Comment on a previous IBJ record</w:t>
             </w:r>
           </w:p>
         </w:tc>
@@ -3865,7 +4254,7 @@
         <w:pStyle w:val="Heading1"/>
         <w:jc w:val="left"/>
       </w:pPr>
-      <w:bookmarkStart w:id="2" w:name="_Toc144756825"/>
+      <w:bookmarkStart w:id="2" w:name="_Toc192672220"/>
       <w:r>
         <w:lastRenderedPageBreak/>
         <w:t>Data Types</w:t>
@@ -4066,40 +4455,18 @@
             <w:tcW w:w="3492" w:type="dxa"/>
           </w:tcPr>
           <w:p>
-            <w:pPr>
-              <w:rPr>
-                <w:b/>
-                <w:bCs/>
-              </w:rPr>
-            </w:pPr>
-            <w:r>
-              <w:rPr>
-                <w:b/>
-                <w:bCs/>
-              </w:rPr>
+            <w:r>
               <w:t>‘0’..’9’,’A’..’F’ or ‘</w:t>
             </w:r>
             <w:proofErr w:type="spellStart"/>
             <w:r>
-              <w:rPr>
-                <w:b/>
-                <w:bCs/>
-              </w:rPr>
               <w:t>a’..’f</w:t>
             </w:r>
             <w:proofErr w:type="spellEnd"/>
             <w:r>
-              <w:rPr>
-                <w:b/>
-                <w:bCs/>
-              </w:rPr>
               <w:t>’</w:t>
             </w:r>
             <w:r>
-              <w:rPr>
-                <w:b/>
-                <w:bCs/>
-              </w:rPr>
               <w:t xml:space="preserve"> as ASCII char</w:t>
             </w:r>
           </w:p>
@@ -4196,17 +4563,7 @@
             <w:tcW w:w="3492" w:type="dxa"/>
           </w:tcPr>
           <w:p>
-            <w:pPr>
-              <w:rPr>
-                <w:b/>
-                <w:bCs/>
-              </w:rPr>
-            </w:pPr>
-            <w:r>
-              <w:rPr>
-                <w:b/>
-                <w:bCs/>
-              </w:rPr>
+            <w:r>
               <w:t>0..255</w:t>
             </w:r>
           </w:p>
@@ -4312,17 +4669,7 @@
             <w:tcW w:w="3492" w:type="dxa"/>
           </w:tcPr>
           <w:p>
-            <w:pPr>
-              <w:rPr>
-                <w:b/>
-                <w:bCs/>
-              </w:rPr>
-            </w:pPr>
-            <w:r>
-              <w:rPr>
-                <w:b/>
-                <w:bCs/>
-              </w:rPr>
+            <w:r>
               <w:t>0..65536</w:t>
             </w:r>
           </w:p>
@@ -4523,11 +4870,9 @@
             <w:tcW w:w="1341" w:type="dxa"/>
           </w:tcPr>
           <w:p>
-            <w:proofErr w:type="spellStart"/>
             <w:r>
               <w:t>LabelNo</w:t>
             </w:r>
-            <w:proofErr w:type="spellEnd"/>
           </w:p>
         </w:tc>
         <w:tc>
@@ -4584,11 +4929,9 @@
             <w:tcW w:w="1341" w:type="dxa"/>
           </w:tcPr>
           <w:p>
-            <w:proofErr w:type="spellStart"/>
             <w:r>
               <w:t>ShortInt</w:t>
             </w:r>
-            <w:proofErr w:type="spellEnd"/>
           </w:p>
         </w:tc>
         <w:tc>
@@ -4645,11 +4988,9 @@
             <w:tcW w:w="1341" w:type="dxa"/>
           </w:tcPr>
           <w:p>
-            <w:proofErr w:type="spellStart"/>
             <w:r>
               <w:t>HexString</w:t>
             </w:r>
-            <w:proofErr w:type="spellEnd"/>
           </w:p>
         </w:tc>
         <w:tc>
@@ -4707,11 +5048,9 @@
             <w:tcW w:w="1341" w:type="dxa"/>
           </w:tcPr>
           <w:p>
-            <w:proofErr w:type="spellStart"/>
             <w:r>
               <w:t>NameString</w:t>
             </w:r>
-            <w:proofErr w:type="spellEnd"/>
           </w:p>
         </w:tc>
         <w:tc>
@@ -4746,13 +5085,8 @@
           </w:p>
           <w:p>
             <w:r>
-              <w:t xml:space="preserve">This forms a sequence of ASCII characters or a </w:t>
-            </w:r>
-            <w:proofErr w:type="gramStart"/>
-            <w:r>
-              <w:t>string</w:t>
-            </w:r>
-            <w:proofErr w:type="gramEnd"/>
+              <w:t>This forms a sequence of ASCII characters or a string</w:t>
+            </w:r>
           </w:p>
           <w:p>
             <w:r>
@@ -4779,7 +5113,7 @@
         <w:pStyle w:val="Heading1"/>
         <w:jc w:val="left"/>
       </w:pPr>
-      <w:bookmarkStart w:id="3" w:name="_Toc144756826"/>
+      <w:bookmarkStart w:id="3" w:name="_Toc192672221"/>
       <w:r>
         <w:t>IBJ RECORDS</w:t>
       </w:r>
@@ -4789,7 +5123,7 @@
       <w:pPr>
         <w:pStyle w:val="Heading2"/>
       </w:pPr>
-      <w:bookmarkStart w:id="4" w:name="_Toc144756827"/>
+      <w:bookmarkStart w:id="4" w:name="_Toc192672222"/>
       <w:r>
         <w:t>OBJ</w:t>
       </w:r>
@@ -4804,8 +5138,8 @@
       <w:tblGrid>
         <w:gridCol w:w="1271"/>
         <w:gridCol w:w="567"/>
-        <w:gridCol w:w="3305"/>
-        <w:gridCol w:w="284"/>
+        <w:gridCol w:w="1985"/>
+        <w:gridCol w:w="1604"/>
         <w:gridCol w:w="3589"/>
       </w:tblGrid>
       <w:tr>
@@ -4845,11 +5179,9 @@
             <w:tcW w:w="3589" w:type="dxa"/>
           </w:tcPr>
           <w:p>
-            <w:proofErr w:type="spellStart"/>
             <w:r>
               <w:t>HexString</w:t>
             </w:r>
-            <w:proofErr w:type="spellEnd"/>
           </w:p>
         </w:tc>
       </w:tr>
@@ -4930,7 +5262,7 @@
         </w:tc>
         <w:tc>
           <w:tcPr>
-            <w:tcW w:w="3872" w:type="dxa"/>
+            <w:tcW w:w="2552" w:type="dxa"/>
             <w:gridSpan w:val="2"/>
           </w:tcPr>
           <w:p>
@@ -4941,7 +5273,7 @@
         </w:tc>
         <w:tc>
           <w:tcPr>
-            <w:tcW w:w="3873" w:type="dxa"/>
+            <w:tcW w:w="5193" w:type="dxa"/>
             <w:gridSpan w:val="2"/>
           </w:tcPr>
           <w:p>
@@ -4962,7 +5294,7 @@
       <w:pPr>
         <w:pStyle w:val="Heading2"/>
       </w:pPr>
-      <w:bookmarkStart w:id="5" w:name="_Toc144756828"/>
+      <w:bookmarkStart w:id="5" w:name="_Toc192672223"/>
       <w:r>
         <w:t>DATA</w:t>
       </w:r>
@@ -5018,11 +5350,9 @@
             <w:tcW w:w="3589" w:type="dxa"/>
           </w:tcPr>
           <w:p>
-            <w:proofErr w:type="spellStart"/>
             <w:r>
               <w:t>ShortInt</w:t>
             </w:r>
-            <w:proofErr w:type="spellEnd"/>
           </w:p>
         </w:tc>
       </w:tr>
@@ -5128,7 +5458,7 @@
       <w:pPr>
         <w:pStyle w:val="Heading2"/>
       </w:pPr>
-      <w:bookmarkStart w:id="6" w:name="_Toc144756829"/>
+      <w:bookmarkStart w:id="6" w:name="_Toc192672224"/>
       <w:r>
         <w:t>CONST</w:t>
       </w:r>
@@ -5184,11 +5514,9 @@
             <w:tcW w:w="3589" w:type="dxa"/>
           </w:tcPr>
           <w:p>
-            <w:proofErr w:type="spellStart"/>
             <w:r>
               <w:t>ShortInt</w:t>
             </w:r>
-            <w:proofErr w:type="spellEnd"/>
           </w:p>
         </w:tc>
       </w:tr>
@@ -5228,13 +5556,8 @@
             <w:gridSpan w:val="4"/>
           </w:tcPr>
           <w:p>
-            <w:proofErr w:type="spellStart"/>
-            <w:r>
-              <w:t>const</w:t>
-            </w:r>
-            <w:proofErr w:type="spellEnd"/>
-            <w:r>
-              <w:t xml:space="preserve"> seg offset code word</w:t>
+            <w:r>
+              <w:t>const seg offset code word</w:t>
             </w:r>
           </w:p>
         </w:tc>
@@ -5290,7 +5613,7 @@
       <w:pPr>
         <w:pStyle w:val="Heading2"/>
       </w:pPr>
-      <w:bookmarkStart w:id="7" w:name="_Toc144756830"/>
+      <w:bookmarkStart w:id="7" w:name="_Toc192672225"/>
       <w:r>
         <w:t>DISPLAY</w:t>
       </w:r>
@@ -5346,11 +5669,9 @@
             <w:tcW w:w="3589" w:type="dxa"/>
           </w:tcPr>
           <w:p>
-            <w:proofErr w:type="spellStart"/>
             <w:r>
               <w:t>ShortInt</w:t>
             </w:r>
-            <w:proofErr w:type="spellEnd"/>
           </w:p>
         </w:tc>
       </w:tr>
@@ -5447,7 +5768,7 @@
       <w:pPr>
         <w:pStyle w:val="Heading2"/>
       </w:pPr>
-      <w:bookmarkStart w:id="8" w:name="_Toc144756831"/>
+      <w:bookmarkStart w:id="8" w:name="_Toc192672226"/>
       <w:r>
         <w:t>JUMP</w:t>
       </w:r>
@@ -5493,11 +5814,9 @@
             <w:gridSpan w:val="2"/>
           </w:tcPr>
           <w:p>
-            <w:proofErr w:type="spellStart"/>
             <w:r>
               <w:t>TargetLabel</w:t>
             </w:r>
-            <w:proofErr w:type="spellEnd"/>
           </w:p>
         </w:tc>
         <w:tc>
@@ -5505,11 +5824,9 @@
             <w:tcW w:w="3589" w:type="dxa"/>
           </w:tcPr>
           <w:p>
-            <w:proofErr w:type="spellStart"/>
             <w:r>
               <w:t>LabelNo</w:t>
             </w:r>
-            <w:proofErr w:type="spellEnd"/>
           </w:p>
         </w:tc>
       </w:tr>
@@ -5604,10 +5921,23 @@
     <w:p/>
     <w:p>
       <w:pPr>
+        <w:rPr>
+          <w:rFonts w:eastAsiaTheme="majorEastAsia" w:cstheme="majorBidi"/>
+          <w:b/>
+          <w:szCs w:val="26"/>
+        </w:rPr>
+      </w:pPr>
+      <w:r>
+        <w:br w:type="page"/>
+      </w:r>
+    </w:p>
+    <w:p>
+      <w:pPr>
         <w:pStyle w:val="Heading2"/>
       </w:pPr>
-      <w:bookmarkStart w:id="9" w:name="_Toc144756832"/>
+      <w:bookmarkStart w:id="9" w:name="_Toc192672227"/>
       <w:r>
+        <w:lastRenderedPageBreak/>
         <w:t>JCOND</w:t>
       </w:r>
       <w:bookmarkEnd w:id="9"/>
@@ -5621,8 +5951,8 @@
       <w:tblGrid>
         <w:gridCol w:w="1271"/>
         <w:gridCol w:w="567"/>
-        <w:gridCol w:w="3305"/>
-        <w:gridCol w:w="284"/>
+        <w:gridCol w:w="2268"/>
+        <w:gridCol w:w="1321"/>
         <w:gridCol w:w="3589"/>
       </w:tblGrid>
       <w:tr>
@@ -5657,11 +5987,9 @@
             <w:gridSpan w:val="2"/>
           </w:tcPr>
           <w:p>
-            <w:proofErr w:type="spellStart"/>
             <w:r>
               <w:t>JumpCondition</w:t>
             </w:r>
-            <w:proofErr w:type="spellEnd"/>
           </w:p>
         </w:tc>
         <w:tc>
@@ -5699,11 +6027,9 @@
             <w:gridSpan w:val="2"/>
           </w:tcPr>
           <w:p>
-            <w:proofErr w:type="spellStart"/>
             <w:r>
               <w:t>TargetLabel</w:t>
             </w:r>
-            <w:proofErr w:type="spellEnd"/>
           </w:p>
         </w:tc>
         <w:tc>
@@ -5711,11 +6037,9 @@
             <w:tcW w:w="3589" w:type="dxa"/>
           </w:tcPr>
           <w:p>
-            <w:proofErr w:type="spellStart"/>
             <w:r>
               <w:t>LabelNo</w:t>
             </w:r>
-            <w:proofErr w:type="spellEnd"/>
           </w:p>
         </w:tc>
       </w:tr>
@@ -5739,13 +6063,292 @@
         </w:tc>
       </w:tr>
       <w:tr>
+        <w:trPr>
+          <w:trHeight w:val="94"/>
+        </w:trPr>
         <w:tc>
           <w:tcPr>
             <w:tcW w:w="1271" w:type="dxa"/>
+            <w:vMerge w:val="restart"/>
           </w:tcPr>
           <w:p>
             <w:r>
               <w:t>Notes:</w:t>
+            </w:r>
+          </w:p>
+        </w:tc>
+        <w:tc>
+          <w:tcPr>
+            <w:tcW w:w="2835" w:type="dxa"/>
+            <w:gridSpan w:val="2"/>
+          </w:tcPr>
+          <w:p>
+            <w:r>
+              <w:t>C</w:t>
+            </w:r>
+            <w:r>
+              <w:t>ond</w:t>
+            </w:r>
+            <w:r>
+              <w:t>itional</w:t>
+            </w:r>
+            <w:r>
+              <w:t xml:space="preserve"> jump to</w:t>
+            </w:r>
+            <w:r>
+              <w:t xml:space="preserve"> a</w:t>
+            </w:r>
+            <w:r>
+              <w:t xml:space="preserve"> label</w:t>
+            </w:r>
+            <w:r>
+              <w:t>.</w:t>
+            </w:r>
+          </w:p>
+        </w:tc>
+        <w:tc>
+          <w:tcPr>
+            <w:tcW w:w="4910" w:type="dxa"/>
+            <w:gridSpan w:val="2"/>
+          </w:tcPr>
+          <w:p>
+            <w:r>
+              <w:t xml:space="preserve"> Condition is one of </w:t>
+            </w:r>
+            <w:r>
+              <w:t>JE, JNE, JLE, JL, JGE, JG</w:t>
+            </w:r>
+          </w:p>
+        </w:tc>
+      </w:tr>
+      <w:tr>
+        <w:trPr>
+          <w:trHeight w:val="91"/>
+        </w:trPr>
+        <w:tc>
+          <w:tcPr>
+            <w:tcW w:w="1271" w:type="dxa"/>
+            <w:vMerge/>
+          </w:tcPr>
+          <w:p/>
+        </w:tc>
+        <w:tc>
+          <w:tcPr>
+            <w:tcW w:w="2835" w:type="dxa"/>
+            <w:gridSpan w:val="2"/>
+          </w:tcPr>
+          <w:p>
+            <w:r>
+              <w:t>JE</w:t>
+            </w:r>
+          </w:p>
+        </w:tc>
+        <w:tc>
+          <w:tcPr>
+            <w:tcW w:w="4910" w:type="dxa"/>
+            <w:gridSpan w:val="2"/>
+          </w:tcPr>
+          <w:p>
+            <w:r>
+              <w:t>Jump If Equal</w:t>
+            </w:r>
+          </w:p>
+        </w:tc>
+      </w:tr>
+      <w:tr>
+        <w:trPr>
+          <w:trHeight w:val="91"/>
+        </w:trPr>
+        <w:tc>
+          <w:tcPr>
+            <w:tcW w:w="1271" w:type="dxa"/>
+            <w:vMerge/>
+          </w:tcPr>
+          <w:p/>
+        </w:tc>
+        <w:tc>
+          <w:tcPr>
+            <w:tcW w:w="2835" w:type="dxa"/>
+            <w:gridSpan w:val="2"/>
+          </w:tcPr>
+          <w:p>
+            <w:r>
+              <w:t>JNE</w:t>
+            </w:r>
+          </w:p>
+        </w:tc>
+        <w:tc>
+          <w:tcPr>
+            <w:tcW w:w="4910" w:type="dxa"/>
+            <w:gridSpan w:val="2"/>
+          </w:tcPr>
+          <w:p>
+            <w:r>
+              <w:t>Jump If Not Equal</w:t>
+            </w:r>
+          </w:p>
+        </w:tc>
+      </w:tr>
+      <w:tr>
+        <w:trPr>
+          <w:trHeight w:val="91"/>
+        </w:trPr>
+        <w:tc>
+          <w:tcPr>
+            <w:tcW w:w="1271" w:type="dxa"/>
+            <w:vMerge/>
+          </w:tcPr>
+          <w:p/>
+        </w:tc>
+        <w:tc>
+          <w:tcPr>
+            <w:tcW w:w="2835" w:type="dxa"/>
+            <w:gridSpan w:val="2"/>
+          </w:tcPr>
+          <w:p>
+            <w:r>
+              <w:t>JLE</w:t>
+            </w:r>
+          </w:p>
+        </w:tc>
+        <w:tc>
+          <w:tcPr>
+            <w:tcW w:w="4910" w:type="dxa"/>
+            <w:gridSpan w:val="2"/>
+          </w:tcPr>
+          <w:p>
+            <w:r>
+              <w:t xml:space="preserve">Jump If Less Than </w:t>
+            </w:r>
+            <w:proofErr w:type="gramStart"/>
+            <w:r>
+              <w:t>Or</w:t>
+            </w:r>
+            <w:proofErr w:type="gramEnd"/>
+            <w:r>
+              <w:t xml:space="preserve"> Equal</w:t>
+            </w:r>
+          </w:p>
+        </w:tc>
+      </w:tr>
+      <w:tr>
+        <w:trPr>
+          <w:trHeight w:val="91"/>
+        </w:trPr>
+        <w:tc>
+          <w:tcPr>
+            <w:tcW w:w="1271" w:type="dxa"/>
+            <w:vMerge/>
+          </w:tcPr>
+          <w:p/>
+        </w:tc>
+        <w:tc>
+          <w:tcPr>
+            <w:tcW w:w="2835" w:type="dxa"/>
+            <w:gridSpan w:val="2"/>
+          </w:tcPr>
+          <w:p>
+            <w:r>
+              <w:t>JL</w:t>
+            </w:r>
+          </w:p>
+        </w:tc>
+        <w:tc>
+          <w:tcPr>
+            <w:tcW w:w="4910" w:type="dxa"/>
+            <w:gridSpan w:val="2"/>
+          </w:tcPr>
+          <w:p>
+            <w:r>
+              <w:t>Jump If Less Than</w:t>
+            </w:r>
+          </w:p>
+        </w:tc>
+      </w:tr>
+      <w:tr>
+        <w:trPr>
+          <w:trHeight w:val="91"/>
+        </w:trPr>
+        <w:tc>
+          <w:tcPr>
+            <w:tcW w:w="1271" w:type="dxa"/>
+            <w:vMerge/>
+          </w:tcPr>
+          <w:p/>
+        </w:tc>
+        <w:tc>
+          <w:tcPr>
+            <w:tcW w:w="2835" w:type="dxa"/>
+            <w:gridSpan w:val="2"/>
+          </w:tcPr>
+          <w:p>
+            <w:r>
+              <w:t>JGE</w:t>
+            </w:r>
+          </w:p>
+        </w:tc>
+        <w:tc>
+          <w:tcPr>
+            <w:tcW w:w="4910" w:type="dxa"/>
+            <w:gridSpan w:val="2"/>
+          </w:tcPr>
+          <w:p>
+            <w:r>
+              <w:t xml:space="preserve">Jump If Greater Than </w:t>
+            </w:r>
+            <w:proofErr w:type="gramStart"/>
+            <w:r>
+              <w:t>Or</w:t>
+            </w:r>
+            <w:proofErr w:type="gramEnd"/>
+            <w:r>
+              <w:t xml:space="preserve"> Equal</w:t>
+            </w:r>
+          </w:p>
+        </w:tc>
+      </w:tr>
+      <w:tr>
+        <w:trPr>
+          <w:trHeight w:val="91"/>
+        </w:trPr>
+        <w:tc>
+          <w:tcPr>
+            <w:tcW w:w="1271" w:type="dxa"/>
+            <w:vMerge/>
+          </w:tcPr>
+          <w:p/>
+        </w:tc>
+        <w:tc>
+          <w:tcPr>
+            <w:tcW w:w="2835" w:type="dxa"/>
+            <w:gridSpan w:val="2"/>
+          </w:tcPr>
+          <w:p>
+            <w:r>
+              <w:t>JG</w:t>
+            </w:r>
+          </w:p>
+        </w:tc>
+        <w:tc>
+          <w:tcPr>
+            <w:tcW w:w="4910" w:type="dxa"/>
+            <w:gridSpan w:val="2"/>
+          </w:tcPr>
+          <w:p>
+            <w:r>
+              <w:t>Jump If Greater Than</w:t>
+            </w:r>
+          </w:p>
+        </w:tc>
+      </w:tr>
+      <w:tr>
+        <w:tc>
+          <w:tcPr>
+            <w:tcW w:w="1271" w:type="dxa"/>
+          </w:tcPr>
+          <w:p>
+            <w:r>
+              <w:t>Error:</w:t>
             </w:r>
           </w:p>
         </w:tc>
@@ -5754,16 +6357,7 @@
             <w:tcW w:w="7745" w:type="dxa"/>
             <w:gridSpan w:val="4"/>
           </w:tcPr>
-          <w:p>
-            <w:proofErr w:type="spellStart"/>
-            <w:r>
-              <w:t>cond</w:t>
-            </w:r>
-            <w:proofErr w:type="spellEnd"/>
-            <w:r>
-              <w:t xml:space="preserve"> jump to label JE, JNE, JLE, JL, JGE, JG</w:t>
-            </w:r>
-          </w:p>
+          <w:p/>
         </w:tc>
       </w:tr>
       <w:tr>
@@ -5773,39 +6367,20 @@
           </w:tcPr>
           <w:p>
             <w:r>
-              <w:t>Error:</w:t>
-            </w:r>
-          </w:p>
-        </w:tc>
-        <w:tc>
-          <w:tcPr>
-            <w:tcW w:w="7745" w:type="dxa"/>
-            <w:gridSpan w:val="4"/>
+              <w:t>Example:</w:t>
+            </w:r>
+          </w:p>
+        </w:tc>
+        <w:tc>
+          <w:tcPr>
+            <w:tcW w:w="2835" w:type="dxa"/>
+            <w:gridSpan w:val="2"/>
           </w:tcPr>
           <w:p/>
         </w:tc>
-      </w:tr>
-      <w:tr>
-        <w:tc>
-          <w:tcPr>
-            <w:tcW w:w="1271" w:type="dxa"/>
-          </w:tcPr>
-          <w:p>
-            <w:r>
-              <w:t>Example:</w:t>
-            </w:r>
-          </w:p>
-        </w:tc>
-        <w:tc>
-          <w:tcPr>
-            <w:tcW w:w="3872" w:type="dxa"/>
-            <w:gridSpan w:val="2"/>
-          </w:tcPr>
-          <w:p/>
-        </w:tc>
-        <w:tc>
-          <w:tcPr>
-            <w:tcW w:w="3873" w:type="dxa"/>
+        <w:tc>
+          <w:tcPr>
+            <w:tcW w:w="4910" w:type="dxa"/>
             <w:gridSpan w:val="2"/>
           </w:tcPr>
           <w:p/>
@@ -5818,9 +6393,8 @@
       <w:pPr>
         <w:pStyle w:val="Heading2"/>
       </w:pPr>
-      <w:bookmarkStart w:id="10" w:name="_Toc144756833"/>
+      <w:bookmarkStart w:id="10" w:name="_Toc192672228"/>
       <w:r>
-        <w:lastRenderedPageBreak/>
         <w:t>CALL</w:t>
       </w:r>
       <w:bookmarkEnd w:id="10"/>
@@ -5865,11 +6439,9 @@
             <w:gridSpan w:val="2"/>
           </w:tcPr>
           <w:p>
-            <w:proofErr w:type="spellStart"/>
             <w:r>
               <w:t>TargetLabel</w:t>
             </w:r>
-            <w:proofErr w:type="spellEnd"/>
           </w:p>
         </w:tc>
         <w:tc>
@@ -5877,11 +6449,9 @@
             <w:tcW w:w="3518" w:type="dxa"/>
           </w:tcPr>
           <w:p>
-            <w:proofErr w:type="spellStart"/>
             <w:r>
               <w:t>LabelNo</w:t>
             </w:r>
-            <w:proofErr w:type="spellEnd"/>
           </w:p>
         </w:tc>
       </w:tr>
@@ -5978,7 +6548,7 @@
       <w:pPr>
         <w:pStyle w:val="Heading2"/>
       </w:pPr>
-      <w:bookmarkStart w:id="11" w:name="_Toc144756834"/>
+      <w:bookmarkStart w:id="11" w:name="_Toc192672229"/>
       <w:r>
         <w:t>LABEL</w:t>
       </w:r>
@@ -6024,11 +6594,9 @@
             <w:gridSpan w:val="2"/>
           </w:tcPr>
           <w:p>
-            <w:proofErr w:type="spellStart"/>
             <w:r>
               <w:t>LabelDef</w:t>
             </w:r>
-            <w:proofErr w:type="spellEnd"/>
           </w:p>
         </w:tc>
         <w:tc>
@@ -6036,11 +6604,9 @@
             <w:tcW w:w="3518" w:type="dxa"/>
           </w:tcPr>
           <w:p>
-            <w:proofErr w:type="spellStart"/>
             <w:r>
               <w:t>LabelNo</w:t>
             </w:r>
-            <w:proofErr w:type="spellEnd"/>
           </w:p>
         </w:tc>
       </w:tr>
@@ -6137,7 +6703,7 @@
       <w:pPr>
         <w:pStyle w:val="Heading2"/>
       </w:pPr>
-      <w:bookmarkStart w:id="12" w:name="_Toc144756835"/>
+      <w:bookmarkStart w:id="12" w:name="_Toc192672230"/>
       <w:r>
         <w:t>FIXUP</w:t>
       </w:r>
@@ -6186,11 +6752,9 @@
             <w:tcW w:w="3518" w:type="dxa"/>
           </w:tcPr>
           <w:p>
-            <w:proofErr w:type="spellStart"/>
             <w:r>
               <w:t>FixupId</w:t>
             </w:r>
-            <w:proofErr w:type="spellEnd"/>
           </w:p>
         </w:tc>
         <w:tc>
@@ -6198,11 +6762,9 @@
             <w:tcW w:w="3518" w:type="dxa"/>
           </w:tcPr>
           <w:p>
-            <w:proofErr w:type="spellStart"/>
             <w:r>
               <w:t>ShortInt</w:t>
             </w:r>
-            <w:proofErr w:type="spellEnd"/>
           </w:p>
         </w:tc>
       </w:tr>
@@ -6229,11 +6791,9 @@
             <w:tcW w:w="3518" w:type="dxa"/>
           </w:tcPr>
           <w:p>
-            <w:proofErr w:type="spellStart"/>
             <w:r>
               <w:t>StringSize</w:t>
             </w:r>
-            <w:proofErr w:type="spellEnd"/>
           </w:p>
         </w:tc>
         <w:tc>
@@ -6270,11 +6830,9 @@
             <w:tcW w:w="3518" w:type="dxa"/>
           </w:tcPr>
           <w:p>
-            <w:proofErr w:type="spellStart"/>
             <w:r>
               <w:t>NameString</w:t>
             </w:r>
-            <w:proofErr w:type="spellEnd"/>
           </w:p>
         </w:tc>
         <w:tc>
@@ -6282,11 +6840,9 @@
             <w:tcW w:w="3518" w:type="dxa"/>
           </w:tcPr>
           <w:p>
-            <w:proofErr w:type="spellStart"/>
             <w:r>
               <w:t>NameString</w:t>
             </w:r>
-            <w:proofErr w:type="spellEnd"/>
           </w:p>
         </w:tc>
       </w:tr>
@@ -6390,7 +6946,7 @@
       <w:pPr>
         <w:pStyle w:val="Heading2"/>
       </w:pPr>
-      <w:bookmarkStart w:id="13" w:name="_Toc144756836"/>
+      <w:bookmarkStart w:id="13" w:name="_Toc192672231"/>
       <w:r>
         <w:t>SETFIX</w:t>
       </w:r>
@@ -6439,11 +6995,9 @@
             <w:tcW w:w="3518" w:type="dxa"/>
           </w:tcPr>
           <w:p>
-            <w:proofErr w:type="spellStart"/>
             <w:r>
               <w:t>FixupId</w:t>
             </w:r>
-            <w:proofErr w:type="spellEnd"/>
           </w:p>
         </w:tc>
         <w:tc>
@@ -6451,11 +7005,9 @@
             <w:tcW w:w="3518" w:type="dxa"/>
           </w:tcPr>
           <w:p>
-            <w:proofErr w:type="spellStart"/>
             <w:r>
               <w:t>ShortInt</w:t>
             </w:r>
-            <w:proofErr w:type="spellEnd"/>
           </w:p>
         </w:tc>
       </w:tr>
@@ -6492,11 +7044,9 @@
             <w:tcW w:w="3518" w:type="dxa"/>
           </w:tcPr>
           <w:p>
-            <w:proofErr w:type="spellStart"/>
             <w:r>
               <w:t>ShortInt</w:t>
             </w:r>
-            <w:proofErr w:type="spellEnd"/>
           </w:p>
         </w:tc>
       </w:tr>
@@ -6533,11 +7083,9 @@
             <w:tcW w:w="3518" w:type="dxa"/>
           </w:tcPr>
           <w:p>
-            <w:proofErr w:type="spellStart"/>
             <w:r>
               <w:t>ShortInt</w:t>
             </w:r>
-            <w:proofErr w:type="spellEnd"/>
           </w:p>
         </w:tc>
       </w:tr>
@@ -6574,11 +7122,9 @@
             <w:tcW w:w="3518" w:type="dxa"/>
           </w:tcPr>
           <w:p>
-            <w:proofErr w:type="spellStart"/>
             <w:r>
               <w:t>ShortInt</w:t>
             </w:r>
-            <w:proofErr w:type="spellEnd"/>
           </w:p>
         </w:tc>
       </w:tr>
@@ -6615,11 +7161,9 @@
             <w:tcW w:w="3518" w:type="dxa"/>
           </w:tcPr>
           <w:p>
-            <w:proofErr w:type="spellStart"/>
             <w:r>
               <w:t>ShortInt</w:t>
             </w:r>
-            <w:proofErr w:type="spellEnd"/>
           </w:p>
         </w:tc>
       </w:tr>
@@ -6715,8 +7259,9 @@
       <w:pPr>
         <w:pStyle w:val="Heading2"/>
       </w:pPr>
-      <w:bookmarkStart w:id="14" w:name="_Toc144756837"/>
+      <w:bookmarkStart w:id="14" w:name="_Toc192672232"/>
       <w:r>
+        <w:lastRenderedPageBreak/>
         <w:t>REQEXT</w:t>
       </w:r>
       <w:bookmarkEnd w:id="14"/>
@@ -6762,11 +7307,9 @@
             <w:tcW w:w="3518" w:type="dxa"/>
           </w:tcPr>
           <w:p>
-            <w:proofErr w:type="spellStart"/>
             <w:r>
               <w:t>ExternalName</w:t>
             </w:r>
-            <w:proofErr w:type="spellEnd"/>
           </w:p>
         </w:tc>
         <w:tc>
@@ -6774,11 +7317,9 @@
             <w:tcW w:w="3518" w:type="dxa"/>
           </w:tcPr>
           <w:p>
-            <w:proofErr w:type="spellStart"/>
             <w:r>
               <w:t>NameString</w:t>
             </w:r>
-            <w:proofErr w:type="spellEnd"/>
           </w:p>
         </w:tc>
       </w:tr>
@@ -6870,20 +7411,12 @@
       </w:tr>
     </w:tbl>
     <w:p/>
-    <w:p/>
-    <w:p/>
-    <w:p/>
-    <w:p/>
-    <w:p/>
-    <w:p/>
-    <w:p/>
     <w:p>
       <w:pPr>
         <w:pStyle w:val="Heading2"/>
       </w:pPr>
-      <w:bookmarkStart w:id="15" w:name="_Toc144756838"/>
+      <w:bookmarkStart w:id="15" w:name="_Toc192672233"/>
       <w:r>
-        <w:lastRenderedPageBreak/>
         <w:t>REFLABEL</w:t>
       </w:r>
       <w:bookmarkEnd w:id="15"/>
@@ -6933,11 +7466,9 @@
             <w:gridSpan w:val="2"/>
           </w:tcPr>
           <w:p>
-            <w:proofErr w:type="spellStart"/>
             <w:r>
               <w:t>LabelRefNo</w:t>
             </w:r>
-            <w:proofErr w:type="spellEnd"/>
           </w:p>
         </w:tc>
         <w:tc>
@@ -6945,11 +7476,9 @@
             <w:tcW w:w="3518" w:type="dxa"/>
           </w:tcPr>
           <w:p>
-            <w:proofErr w:type="spellStart"/>
             <w:r>
               <w:t>ShortInt</w:t>
             </w:r>
-            <w:proofErr w:type="spellEnd"/>
           </w:p>
         </w:tc>
       </w:tr>
@@ -6987,11 +7516,9 @@
             <w:tcW w:w="3518" w:type="dxa"/>
           </w:tcPr>
           <w:p>
-            <w:proofErr w:type="spellStart"/>
             <w:r>
               <w:t>ShortInt</w:t>
             </w:r>
-            <w:proofErr w:type="spellEnd"/>
           </w:p>
         </w:tc>
       </w:tr>
@@ -7084,13 +7611,11 @@
       </w:tr>
     </w:tbl>
     <w:p/>
-    <w:p/>
-    <w:p/>
     <w:p>
       <w:pPr>
         <w:pStyle w:val="Heading2"/>
       </w:pPr>
-      <w:bookmarkStart w:id="16" w:name="_Toc144756839"/>
+      <w:bookmarkStart w:id="16" w:name="_Toc192672234"/>
       <w:r>
         <w:t>REFEXT</w:t>
       </w:r>
@@ -7141,11 +7666,9 @@
             <w:gridSpan w:val="2"/>
           </w:tcPr>
           <w:p>
-            <w:proofErr w:type="spellStart"/>
             <w:r>
               <w:t>ExtNameRef</w:t>
             </w:r>
-            <w:proofErr w:type="spellEnd"/>
           </w:p>
         </w:tc>
         <w:tc>
@@ -7153,11 +7676,9 @@
             <w:tcW w:w="3518" w:type="dxa"/>
           </w:tcPr>
           <w:p>
-            <w:proofErr w:type="spellStart"/>
             <w:r>
               <w:t>ShortInt</w:t>
             </w:r>
-            <w:proofErr w:type="spellEnd"/>
           </w:p>
         </w:tc>
       </w:tr>
@@ -7195,11 +7716,9 @@
             <w:tcW w:w="3518" w:type="dxa"/>
           </w:tcPr>
           <w:p>
-            <w:proofErr w:type="spellStart"/>
             <w:r>
               <w:t>ShortInt</w:t>
             </w:r>
-            <w:proofErr w:type="spellEnd"/>
           </w:p>
         </w:tc>
       </w:tr>
@@ -7296,7 +7815,7 @@
       <w:pPr>
         <w:pStyle w:val="Heading2"/>
       </w:pPr>
-      <w:bookmarkStart w:id="17" w:name="_Toc144756840"/>
+      <w:bookmarkStart w:id="17" w:name="_Toc192672235"/>
       <w:r>
         <w:t>BSS</w:t>
       </w:r>
@@ -7352,11 +7871,9 @@
             <w:tcW w:w="3518" w:type="dxa"/>
           </w:tcPr>
           <w:p>
-            <w:proofErr w:type="spellStart"/>
             <w:r>
               <w:t>ShortInt</w:t>
             </w:r>
-            <w:proofErr w:type="spellEnd"/>
           </w:p>
         </w:tc>
       </w:tr>
@@ -7453,7 +7970,7 @@
       <w:pPr>
         <w:pStyle w:val="Heading2"/>
       </w:pPr>
-      <w:bookmarkStart w:id="18" w:name="_Toc144756841"/>
+      <w:bookmarkStart w:id="18" w:name="_Toc192672236"/>
       <w:r>
         <w:t>COTWORD</w:t>
       </w:r>
@@ -7509,11 +8026,9 @@
             <w:tcW w:w="3589" w:type="dxa"/>
           </w:tcPr>
           <w:p>
-            <w:proofErr w:type="spellStart"/>
             <w:r>
               <w:t>ShortInt</w:t>
             </w:r>
-            <w:proofErr w:type="spellEnd"/>
           </w:p>
         </w:tc>
       </w:tr>
@@ -7610,7 +8125,7 @@
       <w:pPr>
         <w:pStyle w:val="Heading2"/>
       </w:pPr>
-      <w:bookmarkStart w:id="19" w:name="_Toc144756842"/>
+      <w:bookmarkStart w:id="19" w:name="_Toc192672237"/>
       <w:r>
         <w:t>DATWORD</w:t>
       </w:r>
@@ -7666,11 +8181,9 @@
             <w:tcW w:w="3589" w:type="dxa"/>
           </w:tcPr>
           <w:p>
-            <w:proofErr w:type="spellStart"/>
             <w:r>
               <w:t>ShortInt</w:t>
             </w:r>
-            <w:proofErr w:type="spellEnd"/>
           </w:p>
         </w:tc>
       </w:tr>
@@ -7765,10 +8278,23 @@
     <w:p/>
     <w:p>
       <w:pPr>
+        <w:rPr>
+          <w:rFonts w:eastAsiaTheme="majorEastAsia" w:cstheme="majorBidi"/>
+          <w:b/>
+          <w:szCs w:val="26"/>
+        </w:rPr>
+      </w:pPr>
+      <w:r>
+        <w:br w:type="page"/>
+      </w:r>
+    </w:p>
+    <w:p>
+      <w:pPr>
         <w:pStyle w:val="Heading2"/>
       </w:pPr>
-      <w:bookmarkStart w:id="20" w:name="_Toc144756843"/>
+      <w:bookmarkStart w:id="20" w:name="_Toc192672238"/>
       <w:r>
+        <w:lastRenderedPageBreak/>
         <w:t>SWTWORD</w:t>
       </w:r>
       <w:bookmarkEnd w:id="20"/>
@@ -7813,11 +8339,9 @@
             <w:gridSpan w:val="2"/>
           </w:tcPr>
           <w:p>
-            <w:proofErr w:type="spellStart"/>
             <w:r>
               <w:t>SwitchLabelNo</w:t>
             </w:r>
-            <w:proofErr w:type="spellEnd"/>
           </w:p>
         </w:tc>
         <w:tc>
@@ -7825,11 +8349,9 @@
             <w:tcW w:w="3589" w:type="dxa"/>
           </w:tcPr>
           <w:p>
-            <w:proofErr w:type="spellStart"/>
             <w:r>
               <w:t>ShortInt</w:t>
             </w:r>
-            <w:proofErr w:type="spellEnd"/>
           </w:p>
         </w:tc>
       </w:tr>
@@ -7934,7 +8456,7 @@
       <w:pPr>
         <w:pStyle w:val="Heading2"/>
       </w:pPr>
-      <w:bookmarkStart w:id="21" w:name="_Toc144756844"/>
+      <w:bookmarkStart w:id="21" w:name="_Toc192672239"/>
       <w:r>
         <w:t>SOURCE</w:t>
       </w:r>
@@ -7980,11 +8502,9 @@
             <w:gridSpan w:val="2"/>
           </w:tcPr>
           <w:p>
-            <w:proofErr w:type="spellStart"/>
             <w:r>
               <w:t>FileName</w:t>
             </w:r>
-            <w:proofErr w:type="spellEnd"/>
           </w:p>
         </w:tc>
         <w:tc>
@@ -7992,11 +8512,9 @@
             <w:tcW w:w="3589" w:type="dxa"/>
           </w:tcPr>
           <w:p>
-            <w:proofErr w:type="spellStart"/>
             <w:r>
               <w:t>NameString</w:t>
             </w:r>
-            <w:proofErr w:type="spellEnd"/>
           </w:p>
         </w:tc>
       </w:tr>
@@ -8026,7 +8544,6 @@
           </w:tcPr>
           <w:p>
             <w:r>
-              <w:lastRenderedPageBreak/>
               <w:t>Notes:</w:t>
             </w:r>
           </w:p>
@@ -8101,29 +8618,9 @@
     </w:p>
     <w:p>
       <w:pPr>
-        <w:rPr>
-          <w:rFonts w:eastAsiaTheme="majorEastAsia" w:cstheme="majorBidi"/>
-          <w:b/>
-          <w:szCs w:val="26"/>
-          <w:highlight w:val="lightGray"/>
-        </w:rPr>
-      </w:pPr>
-    </w:p>
-    <w:p>
-      <w:pPr>
-        <w:rPr>
-          <w:rFonts w:eastAsiaTheme="majorEastAsia" w:cstheme="majorBidi"/>
-          <w:b/>
-          <w:szCs w:val="26"/>
-          <w:highlight w:val="lightGray"/>
-        </w:rPr>
-      </w:pPr>
-    </w:p>
-    <w:p>
-      <w:pPr>
         <w:pStyle w:val="Heading2"/>
       </w:pPr>
-      <w:bookmarkStart w:id="22" w:name="_Toc144756845"/>
+      <w:bookmarkStart w:id="22" w:name="_Toc192672240"/>
       <w:r>
         <w:t>DEFEXTCODE</w:t>
       </w:r>
@@ -8169,11 +8666,9 @@
             <w:gridSpan w:val="2"/>
           </w:tcPr>
           <w:p>
-            <w:proofErr w:type="spellStart"/>
             <w:r>
               <w:t>ExtCodeName</w:t>
             </w:r>
-            <w:proofErr w:type="spellEnd"/>
           </w:p>
         </w:tc>
         <w:tc>
@@ -8181,11 +8676,9 @@
             <w:tcW w:w="3589" w:type="dxa"/>
           </w:tcPr>
           <w:p>
-            <w:proofErr w:type="spellStart"/>
             <w:r>
               <w:t>NameString</w:t>
             </w:r>
-            <w:proofErr w:type="spellEnd"/>
           </w:p>
         </w:tc>
       </w:tr>
@@ -8282,7 +8775,7 @@
       <w:pPr>
         <w:pStyle w:val="Heading2"/>
       </w:pPr>
-      <w:bookmarkStart w:id="23" w:name="_Toc144756846"/>
+      <w:bookmarkStart w:id="23" w:name="_Toc192672241"/>
       <w:r>
         <w:t>DEFEXTDATA</w:t>
       </w:r>
@@ -8328,11 +8821,9 @@
             <w:gridSpan w:val="2"/>
           </w:tcPr>
           <w:p>
-            <w:proofErr w:type="spellStart"/>
             <w:r>
               <w:t>ExtDataName</w:t>
             </w:r>
-            <w:proofErr w:type="spellEnd"/>
           </w:p>
         </w:tc>
         <w:tc>
@@ -8340,11 +8831,9 @@
             <w:tcW w:w="3589" w:type="dxa"/>
           </w:tcPr>
           <w:p>
-            <w:proofErr w:type="spellStart"/>
             <w:r>
               <w:t>NameString</w:t>
             </w:r>
-            <w:proofErr w:type="spellEnd"/>
           </w:p>
         </w:tc>
       </w:tr>
@@ -8441,7 +8930,7 @@
       <w:pPr>
         <w:pStyle w:val="Heading2"/>
       </w:pPr>
-      <w:bookmarkStart w:id="24" w:name="_Toc144756847"/>
+      <w:bookmarkStart w:id="24" w:name="_Toc192672242"/>
       <w:r>
         <w:t>SWT</w:t>
       </w:r>
@@ -8487,11 +8976,9 @@
             <w:gridSpan w:val="2"/>
           </w:tcPr>
           <w:p>
-            <w:proofErr w:type="spellStart"/>
             <w:r>
               <w:t>TableOffset</w:t>
             </w:r>
-            <w:proofErr w:type="spellEnd"/>
           </w:p>
         </w:tc>
         <w:tc>
@@ -8499,11 +8986,9 @@
             <w:tcW w:w="3589" w:type="dxa"/>
           </w:tcPr>
           <w:p>
-            <w:proofErr w:type="spellStart"/>
             <w:r>
               <w:t>ShortInt</w:t>
             </w:r>
-            <w:proofErr w:type="spellEnd"/>
           </w:p>
         </w:tc>
       </w:tr>
@@ -8600,7 +9085,7 @@
       <w:pPr>
         <w:pStyle w:val="Heading2"/>
       </w:pPr>
-      <w:bookmarkStart w:id="25" w:name="_Toc144756848"/>
+      <w:bookmarkStart w:id="25" w:name="_Toc192672243"/>
       <w:r>
         <w:t>LINE</w:t>
       </w:r>
@@ -8646,11 +9131,9 @@
             <w:gridSpan w:val="2"/>
           </w:tcPr>
           <w:p>
-            <w:proofErr w:type="spellStart"/>
             <w:r>
               <w:t>LineNo</w:t>
             </w:r>
-            <w:proofErr w:type="spellEnd"/>
           </w:p>
         </w:tc>
         <w:tc>
@@ -8658,11 +9141,9 @@
             <w:tcW w:w="3589" w:type="dxa"/>
           </w:tcPr>
           <w:p>
-            <w:proofErr w:type="spellStart"/>
             <w:r>
               <w:t>ShortInt</w:t>
             </w:r>
-            <w:proofErr w:type="spellEnd"/>
           </w:p>
         </w:tc>
       </w:tr>
@@ -8759,7 +9240,7 @@
       <w:pPr>
         <w:pStyle w:val="Heading2"/>
       </w:pPr>
-      <w:bookmarkStart w:id="26" w:name="_Toc144756849"/>
+      <w:bookmarkStart w:id="26" w:name="_Toc192672244"/>
       <w:r>
         <w:t>ABSEXT</w:t>
       </w:r>
@@ -8810,11 +9291,9 @@
             <w:gridSpan w:val="2"/>
           </w:tcPr>
           <w:p>
-            <w:proofErr w:type="spellStart"/>
             <w:r>
               <w:t>ExtNameRefNo</w:t>
             </w:r>
-            <w:proofErr w:type="spellEnd"/>
           </w:p>
         </w:tc>
         <w:tc>
@@ -8822,11 +9301,9 @@
             <w:tcW w:w="3589" w:type="dxa"/>
           </w:tcPr>
           <w:p>
-            <w:proofErr w:type="spellStart"/>
             <w:r>
               <w:t>ShortInt</w:t>
             </w:r>
-            <w:proofErr w:type="spellEnd"/>
           </w:p>
         </w:tc>
       </w:tr>
@@ -8864,11 +9341,9 @@
             <w:tcW w:w="3589" w:type="dxa"/>
           </w:tcPr>
           <w:p>
-            <w:proofErr w:type="spellStart"/>
             <w:r>
               <w:t>ShortInt</w:t>
             </w:r>
-            <w:proofErr w:type="spellEnd"/>
           </w:p>
         </w:tc>
       </w:tr>
@@ -8955,12 +9430,397 @@
           <w:tcPr>
             <w:tcW w:w="3873" w:type="dxa"/>
             <w:gridSpan w:val="2"/>
+          </w:tcPr>
+          <w:p/>
+        </w:tc>
+      </w:tr>
+    </w:tbl>
+    <w:p>
+      <w:pPr>
+        <w:pStyle w:val="Heading2"/>
+      </w:pPr>
+      <w:bookmarkStart w:id="27" w:name="_Toc192672245"/>
+      <w:r>
+        <w:lastRenderedPageBreak/>
+        <w:t>VERSION</w:t>
+      </w:r>
+      <w:bookmarkEnd w:id="27"/>
+    </w:p>
+    <w:tbl>
+      <w:tblPr>
+        <w:tblStyle w:val="TableGrid"/>
+        <w:tblW w:w="0" w:type="auto"/>
+        <w:tblLook w:val="04A0" w:firstRow="1" w:lastRow="0" w:firstColumn="1" w:lastColumn="0" w:noHBand="0" w:noVBand="1"/>
+      </w:tblPr>
+      <w:tblGrid>
+        <w:gridCol w:w="1256"/>
+        <w:gridCol w:w="539"/>
+        <w:gridCol w:w="3729"/>
+        <w:gridCol w:w="3492"/>
+      </w:tblGrid>
+      <w:tr>
+        <w:trPr>
+          <w:trHeight w:val="65"/>
+        </w:trPr>
+        <w:tc>
+          <w:tcPr>
+            <w:tcW w:w="1256" w:type="dxa"/>
+            <w:vMerge w:val="restart"/>
+          </w:tcPr>
+          <w:p>
+            <w:r>
+              <w:t>Instruction:</w:t>
+            </w:r>
+          </w:p>
+        </w:tc>
+        <w:tc>
+          <w:tcPr>
+            <w:tcW w:w="539" w:type="dxa"/>
+            <w:vMerge w:val="restart"/>
+          </w:tcPr>
+          <w:p>
+            <w:r>
+              <w:t>‘X’</w:t>
+            </w:r>
+          </w:p>
+        </w:tc>
+        <w:tc>
+          <w:tcPr>
+            <w:tcW w:w="3729" w:type="dxa"/>
+          </w:tcPr>
+          <w:p>
+            <w:r>
+              <w:t>Major</w:t>
+            </w:r>
+          </w:p>
+        </w:tc>
+        <w:tc>
+          <w:tcPr>
+            <w:tcW w:w="3492" w:type="dxa"/>
+          </w:tcPr>
+          <w:p>
+            <w:r>
+              <w:t>ShortInt</w:t>
+            </w:r>
+          </w:p>
+        </w:tc>
+      </w:tr>
+      <w:tr>
+        <w:trPr>
+          <w:trHeight w:val="65"/>
+        </w:trPr>
+        <w:tc>
+          <w:tcPr>
+            <w:tcW w:w="1256" w:type="dxa"/>
+            <w:vMerge/>
+          </w:tcPr>
+          <w:p/>
+        </w:tc>
+        <w:tc>
+          <w:tcPr>
+            <w:tcW w:w="539" w:type="dxa"/>
+            <w:vMerge/>
+          </w:tcPr>
+          <w:p/>
+        </w:tc>
+        <w:tc>
+          <w:tcPr>
+            <w:tcW w:w="3729" w:type="dxa"/>
+          </w:tcPr>
+          <w:p>
+            <w:r>
+              <w:t>Minor</w:t>
+            </w:r>
+          </w:p>
+        </w:tc>
+        <w:tc>
+          <w:tcPr>
+            <w:tcW w:w="3492" w:type="dxa"/>
+          </w:tcPr>
+          <w:p>
+            <w:r>
+              <w:t>ShortInt</w:t>
+            </w:r>
+          </w:p>
+        </w:tc>
+      </w:tr>
+      <w:tr>
+        <w:trPr>
+          <w:trHeight w:val="299"/>
+        </w:trPr>
+        <w:tc>
+          <w:tcPr>
+            <w:tcW w:w="1256" w:type="dxa"/>
+            <w:vMerge/>
+          </w:tcPr>
+          <w:p/>
+        </w:tc>
+        <w:tc>
+          <w:tcPr>
+            <w:tcW w:w="539" w:type="dxa"/>
+            <w:vMerge/>
+          </w:tcPr>
+          <w:p/>
+        </w:tc>
+        <w:tc>
+          <w:tcPr>
+            <w:tcW w:w="3729" w:type="dxa"/>
+          </w:tcPr>
+          <w:p>
+            <w:r>
+              <w:t>Revision</w:t>
+            </w:r>
+          </w:p>
+        </w:tc>
+        <w:tc>
+          <w:tcPr>
+            <w:tcW w:w="3492" w:type="dxa"/>
+          </w:tcPr>
+          <w:p>
+            <w:r>
+              <w:t>ShortInt</w:t>
+            </w:r>
+          </w:p>
+        </w:tc>
+      </w:tr>
+      <w:tr>
+        <w:tc>
+          <w:tcPr>
+            <w:tcW w:w="1256" w:type="dxa"/>
+          </w:tcPr>
+          <w:p>
+            <w:r>
+              <w:t>Effect:</w:t>
+            </w:r>
+          </w:p>
+        </w:tc>
+        <w:tc>
+          <w:tcPr>
+            <w:tcW w:w="7760" w:type="dxa"/>
+            <w:gridSpan w:val="3"/>
+          </w:tcPr>
+          <w:p/>
+        </w:tc>
+      </w:tr>
+      <w:tr>
+        <w:tc>
+          <w:tcPr>
+            <w:tcW w:w="1256" w:type="dxa"/>
+          </w:tcPr>
+          <w:p>
+            <w:r>
+              <w:t>Notes:</w:t>
+            </w:r>
+          </w:p>
+        </w:tc>
+        <w:tc>
+          <w:tcPr>
+            <w:tcW w:w="7760" w:type="dxa"/>
+            <w:gridSpan w:val="3"/>
+          </w:tcPr>
+          <w:p>
+            <w:r>
+              <w:t>IBJ File format version for this IBJ file</w:t>
+            </w:r>
+          </w:p>
+        </w:tc>
+      </w:tr>
+      <w:tr>
+        <w:tc>
+          <w:tcPr>
+            <w:tcW w:w="1256" w:type="dxa"/>
+          </w:tcPr>
+          <w:p>
+            <w:r>
+              <w:t>Error:</w:t>
+            </w:r>
+          </w:p>
+        </w:tc>
+        <w:tc>
+          <w:tcPr>
+            <w:tcW w:w="7760" w:type="dxa"/>
+            <w:gridSpan w:val="3"/>
+          </w:tcPr>
+          <w:p>
+            <w:r>
+              <w:t>File is in error if this is not the first IBJ record in a file</w:t>
+            </w:r>
+          </w:p>
+        </w:tc>
+      </w:tr>
+      <w:tr>
+        <w:tc>
+          <w:tcPr>
+            <w:tcW w:w="1256" w:type="dxa"/>
+          </w:tcPr>
+          <w:p>
+            <w:r>
+              <w:t>Example:</w:t>
+            </w:r>
+          </w:p>
+        </w:tc>
+        <w:tc>
+          <w:tcPr>
+            <w:tcW w:w="7760" w:type="dxa"/>
+            <w:gridSpan w:val="3"/>
           </w:tcPr>
           <w:p/>
         </w:tc>
       </w:tr>
     </w:tbl>
     <w:p/>
+    <w:p>
+      <w:pPr>
+        <w:pStyle w:val="Heading2"/>
+      </w:pPr>
+      <w:bookmarkStart w:id="28" w:name="_Toc192672246"/>
+      <w:r>
+        <w:t>COMMENT</w:t>
+      </w:r>
+      <w:bookmarkEnd w:id="28"/>
+    </w:p>
+    <w:tbl>
+      <w:tblPr>
+        <w:tblStyle w:val="TableGrid"/>
+        <w:tblW w:w="0" w:type="auto"/>
+        <w:tblLook w:val="04A0" w:firstRow="1" w:lastRow="0" w:firstColumn="1" w:lastColumn="0" w:noHBand="0" w:noVBand="1"/>
+      </w:tblPr>
+      <w:tblGrid>
+        <w:gridCol w:w="1256"/>
+        <w:gridCol w:w="539"/>
+        <w:gridCol w:w="3729"/>
+        <w:gridCol w:w="3492"/>
+      </w:tblGrid>
+      <w:tr>
+        <w:trPr>
+          <w:trHeight w:val="271"/>
+        </w:trPr>
+        <w:tc>
+          <w:tcPr>
+            <w:tcW w:w="1256" w:type="dxa"/>
+          </w:tcPr>
+          <w:p>
+            <w:r>
+              <w:t>Instruction:</w:t>
+            </w:r>
+          </w:p>
+        </w:tc>
+        <w:tc>
+          <w:tcPr>
+            <w:tcW w:w="539" w:type="dxa"/>
+          </w:tcPr>
+          <w:p>
+            <w:r>
+              <w:t>‘Y’</w:t>
+            </w:r>
+          </w:p>
+        </w:tc>
+        <w:tc>
+          <w:tcPr>
+            <w:tcW w:w="3729" w:type="dxa"/>
+          </w:tcPr>
+          <w:p>
+            <w:r>
+              <w:t>Comment</w:t>
+            </w:r>
+          </w:p>
+        </w:tc>
+        <w:tc>
+          <w:tcPr>
+            <w:tcW w:w="3492" w:type="dxa"/>
+          </w:tcPr>
+          <w:p>
+            <w:r>
+              <w:t>NameString</w:t>
+            </w:r>
+          </w:p>
+        </w:tc>
+      </w:tr>
+      <w:tr>
+        <w:tc>
+          <w:tcPr>
+            <w:tcW w:w="1256" w:type="dxa"/>
+          </w:tcPr>
+          <w:p>
+            <w:r>
+              <w:t>Effect:</w:t>
+            </w:r>
+          </w:p>
+        </w:tc>
+        <w:tc>
+          <w:tcPr>
+            <w:tcW w:w="7760" w:type="dxa"/>
+            <w:gridSpan w:val="3"/>
+          </w:tcPr>
+          <w:p>
+            <w:r>
+              <w:t>Can be used as a pragma guiding the Object file generation or as general text</w:t>
+            </w:r>
+          </w:p>
+        </w:tc>
+      </w:tr>
+      <w:tr>
+        <w:tc>
+          <w:tcPr>
+            <w:tcW w:w="1256" w:type="dxa"/>
+          </w:tcPr>
+          <w:p>
+            <w:r>
+              <w:t>Notes:</w:t>
+            </w:r>
+          </w:p>
+        </w:tc>
+        <w:tc>
+          <w:tcPr>
+            <w:tcW w:w="7760" w:type="dxa"/>
+            <w:gridSpan w:val="3"/>
+          </w:tcPr>
+          <w:p>
+            <w:r>
+              <w:t>Comment text referring to a prior IBJ record</w:t>
+            </w:r>
+          </w:p>
+        </w:tc>
+      </w:tr>
+      <w:tr>
+        <w:tc>
+          <w:tcPr>
+            <w:tcW w:w="1256" w:type="dxa"/>
+          </w:tcPr>
+          <w:p>
+            <w:r>
+              <w:t>Error:</w:t>
+            </w:r>
+          </w:p>
+        </w:tc>
+        <w:tc>
+          <w:tcPr>
+            <w:tcW w:w="7760" w:type="dxa"/>
+            <w:gridSpan w:val="3"/>
+          </w:tcPr>
+          <w:p/>
+        </w:tc>
+      </w:tr>
+      <w:tr>
+        <w:tc>
+          <w:tcPr>
+            <w:tcW w:w="1256" w:type="dxa"/>
+          </w:tcPr>
+          <w:p>
+            <w:r>
+              <w:t>Example:</w:t>
+            </w:r>
+          </w:p>
+        </w:tc>
+        <w:tc>
+          <w:tcPr>
+            <w:tcW w:w="7760" w:type="dxa"/>
+            <w:gridSpan w:val="3"/>
+          </w:tcPr>
+          <w:p/>
+        </w:tc>
+      </w:tr>
+    </w:tbl>
     <w:p>
       <w:r>
         <w:br w:type="page"/>
@@ -8970,12 +9830,12 @@
       <w:pPr>
         <w:pStyle w:val="Appendix"/>
       </w:pPr>
-      <w:bookmarkStart w:id="27" w:name="_Toc144756850"/>
+      <w:bookmarkStart w:id="29" w:name="_Toc192672247"/>
       <w:r>
         <w:lastRenderedPageBreak/>
         <w:t>Example IBJ file</w:t>
       </w:r>
-      <w:bookmarkEnd w:id="27"/>
+      <w:bookmarkEnd w:id="29"/>
     </w:p>
     <w:p>
       <w:r>
@@ -8983,6 +9843,11 @@
       </w:r>
     </w:p>
     <w:p/>
+    <w:p>
+      <w:r>
+        <w:t>X06000100000001</w:t>
+      </w:r>
+    </w:p>
     <w:p>
       <w:r>
         <w:t>R0962696C626F2E696D70</w:t>
@@ -9220,7 +10085,7 @@
 </file>
 
 <file path=word/endnotes.xml><?xml version="1.0" encoding="utf-8"?>
-<w:endnotes xmlns:wpc="http://schemas.microsoft.com/office/word/2010/wordprocessingCanvas" xmlns:cx="http://schemas.microsoft.com/office/drawing/2014/chartex" xmlns:cx1="http://schemas.microsoft.com/office/drawing/2015/9/8/chartex" xmlns:cx2="http://schemas.microsoft.com/office/drawing/2015/10/21/chartex" xmlns:cx3="http://schemas.microsoft.com/office/drawing/2016/5/9/chartex" xmlns:cx4="http://schemas.microsoft.com/office/drawing/2016/5/10/chartex" xmlns:cx5="http://schemas.microsoft.com/office/drawing/2016/5/11/chartex" xmlns:cx6="http://schemas.microsoft.com/office/drawing/2016/5/12/chartex" xmlns:cx7="http://schemas.microsoft.com/office/drawing/2016/5/13/chartex" xmlns:cx8="http://schemas.microsoft.com/office/drawing/2016/5/14/chartex" xmlns:mc="http://schemas.openxmlformats.org/markup-compatibility/2006" xmlns:aink="http://schemas.microsoft.com/office/drawing/2016/ink" xmlns:am3d="http://schemas.microsoft.com/office/drawing/2017/model3d" xmlns:o="urn:schemas-microsoft-com:office:office" xmlns:oel="http://schemas.microsoft.com/office/2019/extlst" xmlns:r="http://schemas.openxmlformats.org/officeDocument/2006/relationships" xmlns:m="http://schemas.openxmlformats.org/officeDocument/2006/math" xmlns:v="urn:schemas-microsoft-com:vml" xmlns:wp14="http://schemas.microsoft.com/office/word/2010/wordprocessingDrawing" xmlns:wp="http://schemas.openxmlformats.org/drawingml/2006/wordprocessingDrawing" xmlns:w10="urn:schemas-microsoft-com:office:word" xmlns:w="http://schemas.openxmlformats.org/wordprocessingml/2006/main" xmlns:w14="http://schemas.microsoft.com/office/word/2010/wordml" xmlns:w15="http://schemas.microsoft.com/office/word/2012/wordml" xmlns:w16cex="http://schemas.microsoft.com/office/word/2018/wordml/cex" xmlns:w16cid="http://schemas.microsoft.com/office/word/2016/wordml/cid" xmlns:w16="http://schemas.microsoft.com/office/word/2018/wordml" xmlns:w16sdtdh="http://schemas.microsoft.com/office/word/2020/wordml/sdtdatahash" xmlns:w16se="http://schemas.microsoft.com/office/word/2015/wordml/symex" xmlns:wpg="http://schemas.microsoft.com/office/word/2010/wordprocessingGroup" xmlns:wpi="http://schemas.microsoft.com/office/word/2010/wordprocessingInk" xmlns:wne="http://schemas.microsoft.com/office/word/2006/wordml" xmlns:wps="http://schemas.microsoft.com/office/word/2010/wordprocessingShape" mc:Ignorable="w14 w15 w16se w16cid w16 w16cex w16sdtdh wp14">
+<w:endnotes xmlns:wpc="http://schemas.microsoft.com/office/word/2010/wordprocessingCanvas" xmlns:cx="http://schemas.microsoft.com/office/drawing/2014/chartex" xmlns:cx1="http://schemas.microsoft.com/office/drawing/2015/9/8/chartex" xmlns:cx2="http://schemas.microsoft.com/office/drawing/2015/10/21/chartex" xmlns:cx3="http://schemas.microsoft.com/office/drawing/2016/5/9/chartex" xmlns:cx4="http://schemas.microsoft.com/office/drawing/2016/5/10/chartex" xmlns:cx5="http://schemas.microsoft.com/office/drawing/2016/5/11/chartex" xmlns:cx6="http://schemas.microsoft.com/office/drawing/2016/5/12/chartex" xmlns:cx7="http://schemas.microsoft.com/office/drawing/2016/5/13/chartex" xmlns:cx8="http://schemas.microsoft.com/office/drawing/2016/5/14/chartex" xmlns:mc="http://schemas.openxmlformats.org/markup-compatibility/2006" xmlns:aink="http://schemas.microsoft.com/office/drawing/2016/ink" xmlns:am3d="http://schemas.microsoft.com/office/drawing/2017/model3d" xmlns:o="urn:schemas-microsoft-com:office:office" xmlns:oel="http://schemas.microsoft.com/office/2019/extlst" xmlns:r="http://schemas.openxmlformats.org/officeDocument/2006/relationships" xmlns:m="http://schemas.openxmlformats.org/officeDocument/2006/math" xmlns:v="urn:schemas-microsoft-com:vml" xmlns:wp14="http://schemas.microsoft.com/office/word/2010/wordprocessingDrawing" xmlns:wp="http://schemas.openxmlformats.org/drawingml/2006/wordprocessingDrawing" xmlns:w10="urn:schemas-microsoft-com:office:word" xmlns:w="http://schemas.openxmlformats.org/wordprocessingml/2006/main" xmlns:w14="http://schemas.microsoft.com/office/word/2010/wordml" xmlns:w15="http://schemas.microsoft.com/office/word/2012/wordml" xmlns:w16cex="http://schemas.microsoft.com/office/word/2018/wordml/cex" xmlns:w16cid="http://schemas.microsoft.com/office/word/2016/wordml/cid" xmlns:w16="http://schemas.microsoft.com/office/word/2018/wordml" xmlns:w16du="http://schemas.microsoft.com/office/word/2023/wordml/word16du" xmlns:w16sdtdh="http://schemas.microsoft.com/office/word/2020/wordml/sdtdatahash" xmlns:w16sdtfl="http://schemas.microsoft.com/office/word/2024/wordml/sdtformatlock" xmlns:w16se="http://schemas.microsoft.com/office/word/2015/wordml/symex" xmlns:wpg="http://schemas.microsoft.com/office/word/2010/wordprocessingGroup" xmlns:wpi="http://schemas.microsoft.com/office/word/2010/wordprocessingInk" xmlns:wne="http://schemas.microsoft.com/office/word/2006/wordml" xmlns:wps="http://schemas.microsoft.com/office/word/2010/wordprocessingShape" mc:Ignorable="w14 w15 w16se w16cid w16 w16cex w16sdtdh w16sdtfl w16du wp14">
   <w:endnote w:type="separator" w:id="-1">
     <w:p>
       <w:r>
@@ -9239,7 +10104,7 @@
 </file>
 
 <file path=word/footer1.xml><?xml version="1.0" encoding="utf-8"?>
-<w:ftr xmlns:wpc="http://schemas.microsoft.com/office/word/2010/wordprocessingCanvas" xmlns:cx="http://schemas.microsoft.com/office/drawing/2014/chartex" xmlns:cx1="http://schemas.microsoft.com/office/drawing/2015/9/8/chartex" xmlns:cx2="http://schemas.microsoft.com/office/drawing/2015/10/21/chartex" xmlns:cx3="http://schemas.microsoft.com/office/drawing/2016/5/9/chartex" xmlns:cx4="http://schemas.microsoft.com/office/drawing/2016/5/10/chartex" xmlns:cx5="http://schemas.microsoft.com/office/drawing/2016/5/11/chartex" xmlns:cx6="http://schemas.microsoft.com/office/drawing/2016/5/12/chartex" xmlns:cx7="http://schemas.microsoft.com/office/drawing/2016/5/13/chartex" xmlns:cx8="http://schemas.microsoft.com/office/drawing/2016/5/14/chartex" xmlns:mc="http://schemas.openxmlformats.org/markup-compatibility/2006" xmlns:aink="http://schemas.microsoft.com/office/drawing/2016/ink" xmlns:am3d="http://schemas.microsoft.com/office/drawing/2017/model3d" xmlns:o="urn:schemas-microsoft-com:office:office" xmlns:oel="http://schemas.microsoft.com/office/2019/extlst" xmlns:r="http://schemas.openxmlformats.org/officeDocument/2006/relationships" xmlns:m="http://schemas.openxmlformats.org/officeDocument/2006/math" xmlns:v="urn:schemas-microsoft-com:vml" xmlns:wp14="http://schemas.microsoft.com/office/word/2010/wordprocessingDrawing" xmlns:wp="http://schemas.openxmlformats.org/drawingml/2006/wordprocessingDrawing" xmlns:w10="urn:schemas-microsoft-com:office:word" xmlns:w="http://schemas.openxmlformats.org/wordprocessingml/2006/main" xmlns:w14="http://schemas.microsoft.com/office/word/2010/wordml" xmlns:w15="http://schemas.microsoft.com/office/word/2012/wordml" xmlns:w16cex="http://schemas.microsoft.com/office/word/2018/wordml/cex" xmlns:w16cid="http://schemas.microsoft.com/office/word/2016/wordml/cid" xmlns:w16="http://schemas.microsoft.com/office/word/2018/wordml" xmlns:w16sdtdh="http://schemas.microsoft.com/office/word/2020/wordml/sdtdatahash" xmlns:w16se="http://schemas.microsoft.com/office/word/2015/wordml/symex" xmlns:wpg="http://schemas.microsoft.com/office/word/2010/wordprocessingGroup" xmlns:wpi="http://schemas.microsoft.com/office/word/2010/wordprocessingInk" xmlns:wne="http://schemas.microsoft.com/office/word/2006/wordml" xmlns:wps="http://schemas.microsoft.com/office/word/2010/wordprocessingShape" mc:Ignorable="w14 w15 w16se w16cid w16 w16cex w16sdtdh wp14">
+<w:ftr xmlns:wpc="http://schemas.microsoft.com/office/word/2010/wordprocessingCanvas" xmlns:cx="http://schemas.microsoft.com/office/drawing/2014/chartex" xmlns:cx1="http://schemas.microsoft.com/office/drawing/2015/9/8/chartex" xmlns:cx2="http://schemas.microsoft.com/office/drawing/2015/10/21/chartex" xmlns:cx3="http://schemas.microsoft.com/office/drawing/2016/5/9/chartex" xmlns:cx4="http://schemas.microsoft.com/office/drawing/2016/5/10/chartex" xmlns:cx5="http://schemas.microsoft.com/office/drawing/2016/5/11/chartex" xmlns:cx6="http://schemas.microsoft.com/office/drawing/2016/5/12/chartex" xmlns:cx7="http://schemas.microsoft.com/office/drawing/2016/5/13/chartex" xmlns:cx8="http://schemas.microsoft.com/office/drawing/2016/5/14/chartex" xmlns:mc="http://schemas.openxmlformats.org/markup-compatibility/2006" xmlns:aink="http://schemas.microsoft.com/office/drawing/2016/ink" xmlns:am3d="http://schemas.microsoft.com/office/drawing/2017/model3d" xmlns:o="urn:schemas-microsoft-com:office:office" xmlns:oel="http://schemas.microsoft.com/office/2019/extlst" xmlns:r="http://schemas.openxmlformats.org/officeDocument/2006/relationships" xmlns:m="http://schemas.openxmlformats.org/officeDocument/2006/math" xmlns:v="urn:schemas-microsoft-com:vml" xmlns:wp14="http://schemas.microsoft.com/office/word/2010/wordprocessingDrawing" xmlns:wp="http://schemas.openxmlformats.org/drawingml/2006/wordprocessingDrawing" xmlns:w10="urn:schemas-microsoft-com:office:word" xmlns:w="http://schemas.openxmlformats.org/wordprocessingml/2006/main" xmlns:w14="http://schemas.microsoft.com/office/word/2010/wordml" xmlns:w15="http://schemas.microsoft.com/office/word/2012/wordml" xmlns:w16cex="http://schemas.microsoft.com/office/word/2018/wordml/cex" xmlns:w16cid="http://schemas.microsoft.com/office/word/2016/wordml/cid" xmlns:w16="http://schemas.microsoft.com/office/word/2018/wordml" xmlns:w16du="http://schemas.microsoft.com/office/word/2023/wordml/word16du" xmlns:w16sdtdh="http://schemas.microsoft.com/office/word/2020/wordml/sdtdatahash" xmlns:w16sdtfl="http://schemas.microsoft.com/office/word/2024/wordml/sdtformatlock" xmlns:w16se="http://schemas.microsoft.com/office/word/2015/wordml/symex" xmlns:wpg="http://schemas.microsoft.com/office/word/2010/wordprocessingGroup" xmlns:wpi="http://schemas.microsoft.com/office/word/2010/wordprocessingInk" xmlns:wne="http://schemas.microsoft.com/office/word/2006/wordml" xmlns:wps="http://schemas.microsoft.com/office/word/2010/wordprocessingShape" mc:Ignorable="w14 w15 w16se w16cid w16 w16cex w16sdtdh w16sdtfl w16du wp14">
   <w:sdt>
     <w:sdtPr>
       <w:id w:val="1872651829"/>
@@ -9367,7 +10232,7 @@
 </file>
 
 <file path=word/footnotes.xml><?xml version="1.0" encoding="utf-8"?>
-<w:footnotes xmlns:wpc="http://schemas.microsoft.com/office/word/2010/wordprocessingCanvas" xmlns:cx="http://schemas.microsoft.com/office/drawing/2014/chartex" xmlns:cx1="http://schemas.microsoft.com/office/drawing/2015/9/8/chartex" xmlns:cx2="http://schemas.microsoft.com/office/drawing/2015/10/21/chartex" xmlns:cx3="http://schemas.microsoft.com/office/drawing/2016/5/9/chartex" xmlns:cx4="http://schemas.microsoft.com/office/drawing/2016/5/10/chartex" xmlns:cx5="http://schemas.microsoft.com/office/drawing/2016/5/11/chartex" xmlns:cx6="http://schemas.microsoft.com/office/drawing/2016/5/12/chartex" xmlns:cx7="http://schemas.microsoft.com/office/drawing/2016/5/13/chartex" xmlns:cx8="http://schemas.microsoft.com/office/drawing/2016/5/14/chartex" xmlns:mc="http://schemas.openxmlformats.org/markup-compatibility/2006" xmlns:aink="http://schemas.microsoft.com/office/drawing/2016/ink" xmlns:am3d="http://schemas.microsoft.com/office/drawing/2017/model3d" xmlns:o="urn:schemas-microsoft-com:office:office" xmlns:oel="http://schemas.microsoft.com/office/2019/extlst" xmlns:r="http://schemas.openxmlformats.org/officeDocument/2006/relationships" xmlns:m="http://schemas.openxmlformats.org/officeDocument/2006/math" xmlns:v="urn:schemas-microsoft-com:vml" xmlns:wp14="http://schemas.microsoft.com/office/word/2010/wordprocessingDrawing" xmlns:wp="http://schemas.openxmlformats.org/drawingml/2006/wordprocessingDrawing" xmlns:w10="urn:schemas-microsoft-com:office:word" xmlns:w="http://schemas.openxmlformats.org/wordprocessingml/2006/main" xmlns:w14="http://schemas.microsoft.com/office/word/2010/wordml" xmlns:w15="http://schemas.microsoft.com/office/word/2012/wordml" xmlns:w16cex="http://schemas.microsoft.com/office/word/2018/wordml/cex" xmlns:w16cid="http://schemas.microsoft.com/office/word/2016/wordml/cid" xmlns:w16="http://schemas.microsoft.com/office/word/2018/wordml" xmlns:w16sdtdh="http://schemas.microsoft.com/office/word/2020/wordml/sdtdatahash" xmlns:w16se="http://schemas.microsoft.com/office/word/2015/wordml/symex" xmlns:wpg="http://schemas.microsoft.com/office/word/2010/wordprocessingGroup" xmlns:wpi="http://schemas.microsoft.com/office/word/2010/wordprocessingInk" xmlns:wne="http://schemas.microsoft.com/office/word/2006/wordml" xmlns:wps="http://schemas.microsoft.com/office/word/2010/wordprocessingShape" mc:Ignorable="w14 w15 w16se w16cid w16 w16cex w16sdtdh wp14">
+<w:footnotes xmlns:wpc="http://schemas.microsoft.com/office/word/2010/wordprocessingCanvas" xmlns:cx="http://schemas.microsoft.com/office/drawing/2014/chartex" xmlns:cx1="http://schemas.microsoft.com/office/drawing/2015/9/8/chartex" xmlns:cx2="http://schemas.microsoft.com/office/drawing/2015/10/21/chartex" xmlns:cx3="http://schemas.microsoft.com/office/drawing/2016/5/9/chartex" xmlns:cx4="http://schemas.microsoft.com/office/drawing/2016/5/10/chartex" xmlns:cx5="http://schemas.microsoft.com/office/drawing/2016/5/11/chartex" xmlns:cx6="http://schemas.microsoft.com/office/drawing/2016/5/12/chartex" xmlns:cx7="http://schemas.microsoft.com/office/drawing/2016/5/13/chartex" xmlns:cx8="http://schemas.microsoft.com/office/drawing/2016/5/14/chartex" xmlns:mc="http://schemas.openxmlformats.org/markup-compatibility/2006" xmlns:aink="http://schemas.microsoft.com/office/drawing/2016/ink" xmlns:am3d="http://schemas.microsoft.com/office/drawing/2017/model3d" xmlns:o="urn:schemas-microsoft-com:office:office" xmlns:oel="http://schemas.microsoft.com/office/2019/extlst" xmlns:r="http://schemas.openxmlformats.org/officeDocument/2006/relationships" xmlns:m="http://schemas.openxmlformats.org/officeDocument/2006/math" xmlns:v="urn:schemas-microsoft-com:vml" xmlns:wp14="http://schemas.microsoft.com/office/word/2010/wordprocessingDrawing" xmlns:wp="http://schemas.openxmlformats.org/drawingml/2006/wordprocessingDrawing" xmlns:w10="urn:schemas-microsoft-com:office:word" xmlns:w="http://schemas.openxmlformats.org/wordprocessingml/2006/main" xmlns:w14="http://schemas.microsoft.com/office/word/2010/wordml" xmlns:w15="http://schemas.microsoft.com/office/word/2012/wordml" xmlns:w16cex="http://schemas.microsoft.com/office/word/2018/wordml/cex" xmlns:w16cid="http://schemas.microsoft.com/office/word/2016/wordml/cid" xmlns:w16="http://schemas.microsoft.com/office/word/2018/wordml" xmlns:w16du="http://schemas.microsoft.com/office/word/2023/wordml/word16du" xmlns:w16sdtdh="http://schemas.microsoft.com/office/word/2020/wordml/sdtdatahash" xmlns:w16sdtfl="http://schemas.microsoft.com/office/word/2024/wordml/sdtformatlock" xmlns:w16se="http://schemas.microsoft.com/office/word/2015/wordml/symex" xmlns:wpg="http://schemas.microsoft.com/office/word/2010/wordprocessingGroup" xmlns:wpi="http://schemas.microsoft.com/office/word/2010/wordprocessingInk" xmlns:wne="http://schemas.microsoft.com/office/word/2006/wordml" xmlns:wps="http://schemas.microsoft.com/office/word/2010/wordprocessingShape" mc:Ignorable="w14 w15 w16se w16cid w16 w16cex w16sdtdh w16sdtfl w16du wp14">
   <w:footnote w:type="separator" w:id="-1">
     <w:p>
       <w:r>
@@ -9386,7 +10251,7 @@
 </file>
 
 <file path=word/numbering.xml><?xml version="1.0" encoding="utf-8"?>
-<w:numbering xmlns:wpc="http://schemas.microsoft.com/office/word/2010/wordprocessingCanvas" xmlns:cx="http://schemas.microsoft.com/office/drawing/2014/chartex" xmlns:cx1="http://schemas.microsoft.com/office/drawing/2015/9/8/chartex" xmlns:cx2="http://schemas.microsoft.com/office/drawing/2015/10/21/chartex" xmlns:cx3="http://schemas.microsoft.com/office/drawing/2016/5/9/chartex" xmlns:cx4="http://schemas.microsoft.com/office/drawing/2016/5/10/chartex" xmlns:cx5="http://schemas.microsoft.com/office/drawing/2016/5/11/chartex" xmlns:cx6="http://schemas.microsoft.com/office/drawing/2016/5/12/chartex" xmlns:cx7="http://schemas.microsoft.com/office/drawing/2016/5/13/chartex" xmlns:cx8="http://schemas.microsoft.com/office/drawing/2016/5/14/chartex" xmlns:mc="http://schemas.openxmlformats.org/markup-compatibility/2006" xmlns:aink="http://schemas.microsoft.com/office/drawing/2016/ink" xmlns:am3d="http://schemas.microsoft.com/office/drawing/2017/model3d" xmlns:o="urn:schemas-microsoft-com:office:office" xmlns:oel="http://schemas.microsoft.com/office/2019/extlst" xmlns:r="http://schemas.openxmlformats.org/officeDocument/2006/relationships" xmlns:m="http://schemas.openxmlformats.org/officeDocument/2006/math" xmlns:v="urn:schemas-microsoft-com:vml" xmlns:wp14="http://schemas.microsoft.com/office/word/2010/wordprocessingDrawing" xmlns:wp="http://schemas.openxmlformats.org/drawingml/2006/wordprocessingDrawing" xmlns:w10="urn:schemas-microsoft-com:office:word" xmlns:w="http://schemas.openxmlformats.org/wordprocessingml/2006/main" xmlns:w14="http://schemas.microsoft.com/office/word/2010/wordml" xmlns:w15="http://schemas.microsoft.com/office/word/2012/wordml" xmlns:w16cex="http://schemas.microsoft.com/office/word/2018/wordml/cex" xmlns:w16cid="http://schemas.microsoft.com/office/word/2016/wordml/cid" xmlns:w16="http://schemas.microsoft.com/office/word/2018/wordml" xmlns:w16sdtdh="http://schemas.microsoft.com/office/word/2020/wordml/sdtdatahash" xmlns:w16se="http://schemas.microsoft.com/office/word/2015/wordml/symex" xmlns:wpg="http://schemas.microsoft.com/office/word/2010/wordprocessingGroup" xmlns:wpi="http://schemas.microsoft.com/office/word/2010/wordprocessingInk" xmlns:wne="http://schemas.microsoft.com/office/word/2006/wordml" xmlns:wps="http://schemas.microsoft.com/office/word/2010/wordprocessingShape" mc:Ignorable="w14 w15 w16se w16cid w16 w16cex w16sdtdh wp14">
+<w:numbering xmlns:wpc="http://schemas.microsoft.com/office/word/2010/wordprocessingCanvas" xmlns:cx="http://schemas.microsoft.com/office/drawing/2014/chartex" xmlns:cx1="http://schemas.microsoft.com/office/drawing/2015/9/8/chartex" xmlns:cx2="http://schemas.microsoft.com/office/drawing/2015/10/21/chartex" xmlns:cx3="http://schemas.microsoft.com/office/drawing/2016/5/9/chartex" xmlns:cx4="http://schemas.microsoft.com/office/drawing/2016/5/10/chartex" xmlns:cx5="http://schemas.microsoft.com/office/drawing/2016/5/11/chartex" xmlns:cx6="http://schemas.microsoft.com/office/drawing/2016/5/12/chartex" xmlns:cx7="http://schemas.microsoft.com/office/drawing/2016/5/13/chartex" xmlns:cx8="http://schemas.microsoft.com/office/drawing/2016/5/14/chartex" xmlns:mc="http://schemas.openxmlformats.org/markup-compatibility/2006" xmlns:aink="http://schemas.microsoft.com/office/drawing/2016/ink" xmlns:am3d="http://schemas.microsoft.com/office/drawing/2017/model3d" xmlns:o="urn:schemas-microsoft-com:office:office" xmlns:oel="http://schemas.microsoft.com/office/2019/extlst" xmlns:r="http://schemas.openxmlformats.org/officeDocument/2006/relationships" xmlns:m="http://schemas.openxmlformats.org/officeDocument/2006/math" xmlns:v="urn:schemas-microsoft-com:vml" xmlns:wp14="http://schemas.microsoft.com/office/word/2010/wordprocessingDrawing" xmlns:wp="http://schemas.openxmlformats.org/drawingml/2006/wordprocessingDrawing" xmlns:w10="urn:schemas-microsoft-com:office:word" xmlns:w="http://schemas.openxmlformats.org/wordprocessingml/2006/main" xmlns:w14="http://schemas.microsoft.com/office/word/2010/wordml" xmlns:w15="http://schemas.microsoft.com/office/word/2012/wordml" xmlns:w16cex="http://schemas.microsoft.com/office/word/2018/wordml/cex" xmlns:w16cid="http://schemas.microsoft.com/office/word/2016/wordml/cid" xmlns:w16="http://schemas.microsoft.com/office/word/2018/wordml" xmlns:w16du="http://schemas.microsoft.com/office/word/2023/wordml/word16du" xmlns:w16sdtdh="http://schemas.microsoft.com/office/word/2020/wordml/sdtdatahash" xmlns:w16sdtfl="http://schemas.microsoft.com/office/word/2024/wordml/sdtformatlock" xmlns:w16se="http://schemas.microsoft.com/office/word/2015/wordml/symex" xmlns:wpg="http://schemas.microsoft.com/office/word/2010/wordprocessingGroup" xmlns:wpi="http://schemas.microsoft.com/office/word/2010/wordprocessingInk" xmlns:wne="http://schemas.microsoft.com/office/word/2006/wordml" xmlns:wps="http://schemas.microsoft.com/office/word/2010/wordprocessingShape" mc:Ignorable="w14 w15 w16se w16cid w16 w16cex w16sdtdh w16sdtfl w16du wp14">
   <w:abstractNum w:abstractNumId="0" w15:restartNumberingAfterBreak="0">
     <w:nsid w:val="00D47AF8"/>
     <w:multiLevelType w:val="hybridMultilevel"/>
@@ -14502,7 +15367,7 @@
   <w:abstractNum w:abstractNumId="59" w15:restartNumberingAfterBreak="0">
     <w:nsid w:val="523E5BCF"/>
     <w:multiLevelType w:val="hybridMultilevel"/>
-    <w:tmpl w:val="8CB4375E"/>
+    <w:tmpl w:val="D598B83E"/>
     <w:lvl w:ilvl="0" w:tplc="FBE2A814">
       <w:start w:val="1"/>
       <w:numFmt w:val="decimal"/>
@@ -17890,12 +18755,18 @@
   <w:num w:numId="96" w16cid:durableId="130369325">
     <w:abstractNumId w:val="59"/>
   </w:num>
+  <w:num w:numId="97" w16cid:durableId="1384478620">
+    <w:abstractNumId w:val="59"/>
+    <w:lvlOverride w:ilvl="0">
+      <w:startOverride w:val="1"/>
+    </w:lvlOverride>
+  </w:num>
   <w:numIdMacAtCleanup w:val="92"/>
 </w:numbering>
 </file>
 
 <file path=word/styles.xml><?xml version="1.0" encoding="utf-8"?>
-<w:styles xmlns:mc="http://schemas.openxmlformats.org/markup-compatibility/2006" xmlns:r="http://schemas.openxmlformats.org/officeDocument/2006/relationships" xmlns:w="http://schemas.openxmlformats.org/wordprocessingml/2006/main" xmlns:w14="http://schemas.microsoft.com/office/word/2010/wordml" xmlns:w15="http://schemas.microsoft.com/office/word/2012/wordml" xmlns:w16cex="http://schemas.microsoft.com/office/word/2018/wordml/cex" xmlns:w16cid="http://schemas.microsoft.com/office/word/2016/wordml/cid" xmlns:w16="http://schemas.microsoft.com/office/word/2018/wordml" xmlns:w16sdtdh="http://schemas.microsoft.com/office/word/2020/wordml/sdtdatahash" xmlns:w16se="http://schemas.microsoft.com/office/word/2015/wordml/symex" mc:Ignorable="w14 w15 w16se w16cid w16 w16cex w16sdtdh">
+<w:styles xmlns:mc="http://schemas.openxmlformats.org/markup-compatibility/2006" xmlns:r="http://schemas.openxmlformats.org/officeDocument/2006/relationships" xmlns:w="http://schemas.openxmlformats.org/wordprocessingml/2006/main" xmlns:w14="http://schemas.microsoft.com/office/word/2010/wordml" xmlns:w15="http://schemas.microsoft.com/office/word/2012/wordml" xmlns:w16cex="http://schemas.microsoft.com/office/word/2018/wordml/cex" xmlns:w16cid="http://schemas.microsoft.com/office/word/2016/wordml/cid" xmlns:w16="http://schemas.microsoft.com/office/word/2018/wordml" xmlns:w16du="http://schemas.microsoft.com/office/word/2023/wordml/word16du" xmlns:w16sdtdh="http://schemas.microsoft.com/office/word/2020/wordml/sdtdatahash" xmlns:w16sdtfl="http://schemas.microsoft.com/office/word/2024/wordml/sdtformatlock" xmlns:w16se="http://schemas.microsoft.com/office/word/2015/wordml/symex" mc:Ignorable="w14 w15 w16se w16cid w16 w16cex w16sdtdh w16sdtfl w16du">
   <w:docDefaults>
     <w:rPrDefault>
       <w:rPr>
@@ -18288,7 +19159,7 @@
   <w:style w:type="paragraph" w:default="1" w:styleId="Normal">
     <w:name w:val="Normal"/>
     <w:qFormat/>
-    <w:rsid w:val="007640A5"/>
+    <w:rsid w:val="00994699"/>
   </w:style>
   <w:style w:type="paragraph" w:styleId="Heading1">
     <w:name w:val="heading 1"/>
@@ -18365,6 +19236,7 @@
   <w:style w:type="character" w:default="1" w:styleId="DefaultParagraphFont">
     <w:name w:val="Default Paragraph Font"/>
     <w:uiPriority w:val="1"/>
+    <w:semiHidden/>
     <w:unhideWhenUsed/>
   </w:style>
   <w:style w:type="table" w:default="1" w:styleId="TableNormal">

</xml_diff>